<commit_message>
Publish verified live RTL results, genuine screenshot, and completed proposal
</commit_message>
<xml_diff>
--- a/proposal/capstone_proposal.docx
+++ b/proposal/capstone_proposal.docx
@@ -80,10 +80,7 @@
         <w:t xml:space="preserve">README.md</w:t>
       </w:r>
       <w:r>
-        <w:t xml:space="preserve"> </w:t>
-      </w:r>
-      <w:r>
-        <w:t xml:space="preserve">(setup);</w:t>
+        <w:t xml:space="preserve">,</w:t>
       </w:r>
       <w:r>
         <w:t xml:space="preserve"> </w:t>
@@ -95,10 +92,7 @@
         <w:t xml:space="preserve">.env.example</w:t>
       </w:r>
       <w:r>
-        <w:t xml:space="preserve"> </w:t>
-      </w:r>
-      <w:r>
-        <w:t xml:space="preserve">(API variables);</w:t>
+        <w:t xml:space="preserve">, and</w:t>
       </w:r>
       <w:r>
         <w:t xml:space="preserve"> </w:t>
@@ -110,10 +104,7 @@
         <w:t xml:space="preserve">examples/counter/</w:t>
       </w:r>
       <w:r>
-        <w:t xml:space="preserve"> </w:t>
-      </w:r>
-      <w:r>
-        <w:t xml:space="preserve">(inputs).</w:t>
+        <w:t xml:space="preserve">.</w:t>
       </w:r>
     </w:p>
     <w:bookmarkEnd w:id="20"/>
@@ -131,25 +122,25 @@
         <w:pStyle w:val="FirstParagraph"/>
       </w:pPr>
       <w:r>
-        <w:t xml:space="preserve">The task is to convert a natural-language hardware specification and fixed module</w:t>
-      </w:r>
-      <w:r>
-        <w:t xml:space="preserve"> </w:t>
-      </w:r>
-      <w:r>
-        <w:t xml:space="preserve">interface into synthesizable SystemVerilog for an RTL designer. An externally</w:t>
-      </w:r>
-      <w:r>
-        <w:t xml:space="preserve"> </w:t>
-      </w:r>
-      <w:r>
-        <w:t xml:space="preserve">provided testbench independently evaluates the output. Success requires compilation</w:t>
-      </w:r>
-      <w:r>
-        <w:t xml:space="preserve"> </w:t>
-      </w:r>
-      <w:r>
-        <w:t xml:space="preserve">with exit code zero, successful simulation, and an explicit</w:t>
+        <w:t xml:space="preserve">For an RTL designer, convert a natural-language hardware specification and fixed</w:t>
+      </w:r>
+      <w:r>
+        <w:t xml:space="preserve"> </w:t>
+      </w:r>
+      <w:r>
+        <w:t xml:space="preserve">module interface into synthesizable SystemVerilog. An external testbench evaluates</w:t>
+      </w:r>
+      <w:r>
+        <w:t xml:space="preserve"> </w:t>
+      </w:r>
+      <w:r>
+        <w:t xml:space="preserve">the output. Success requires compilation and simulation exit codes of zero, an</w:t>
+      </w:r>
+      <w:r>
+        <w:t xml:space="preserve"> </w:t>
+      </w:r>
+      <w:r>
+        <w:t xml:space="preserve">explicit</w:t>
       </w:r>
       <w:r>
         <w:t xml:space="preserve"> </w:t>
@@ -161,10 +152,7 @@
         <w:t xml:space="preserve">TEST_PASS</w:t>
       </w:r>
       <w:r>
-        <w:t xml:space="preserve"> </w:t>
-      </w:r>
-      <w:r>
-        <w:t xml:space="preserve">with no</w:t>
+        <w:t xml:space="preserve">, and no</w:t>
       </w:r>
       <w:r>
         <w:t xml:space="preserve"> </w:t>
@@ -176,25 +164,25 @@
         <w:t xml:space="preserve">TEST_FAIL</w:t>
       </w:r>
       <w:r>
-        <w:t xml:space="preserve">. Syntax/interface errors, runtime errors, timeouts, mismatches, or a</w:t>
-      </w:r>
-      <w:r>
-        <w:t xml:space="preserve"> </w:t>
-      </w:r>
-      <w:r>
-        <w:t xml:space="preserve">missing pass marker are failures. The research question is whether iterative use</w:t>
-      </w:r>
-      <w:r>
-        <w:t xml:space="preserve"> </w:t>
-      </w:r>
-      <w:r>
-        <w:t xml:space="preserve">of compiler and simulator feedback improves functional pass rate over one-shot</w:t>
-      </w:r>
-      <w:r>
-        <w:t xml:space="preserve"> </w:t>
-      </w:r>
-      <w:r>
-        <w:t xml:space="preserve">LLM generation.</w:t>
+        <w:t xml:space="preserve">. Syntax/interface errors, timeouts,</w:t>
+      </w:r>
+      <w:r>
+        <w:t xml:space="preserve"> </w:t>
+      </w:r>
+      <w:r>
+        <w:t xml:space="preserve">functional mismatches, and missing pass markers are failures. Research question:</w:t>
+      </w:r>
+      <w:r>
+        <w:t xml:space="preserve"> </w:t>
+      </w:r>
+      <w:r>
+        <w:t xml:space="preserve">can an LLM using compiler/simulator feedback achieve a higher functional pass rate</w:t>
+      </w:r>
+      <w:r>
+        <w:t xml:space="preserve"> </w:t>
+      </w:r>
+      <w:r>
+        <w:t xml:space="preserve">than one-shot generation?</w:t>
       </w:r>
     </w:p>
     <w:bookmarkEnd w:id="21"/>
@@ -212,49 +200,43 @@
         <w:pStyle w:val="FirstParagraph"/>
       </w:pPr>
       <w:r>
-        <w:t xml:space="preserve">LLM-generated RTL can contain syntax, interface, timing, and functional errors.</w:t>
-      </w:r>
-      <w:r>
-        <w:t xml:space="preserve"> </w:t>
-      </w:r>
-      <w:r>
-        <w:t xml:space="preserve">Compiler diagnostics and simulation mismatches supply objective evidence for a</w:t>
-      </w:r>
-      <w:r>
-        <w:t xml:space="preserve"> </w:t>
-      </w:r>
-      <w:r>
-        <w:t xml:space="preserve">generate–observe–repair workflow. Open-source Icarus Verilog makes automated</w:t>
-      </w:r>
-      <w:r>
-        <w:t xml:space="preserve"> </w:t>
-      </w:r>
-      <w:r>
-        <w:t xml:space="preserve">evaluation feasible within a semester. The current implementation covers one-shot</w:t>
-      </w:r>
-      <w:r>
-        <w:t xml:space="preserve"> </w:t>
-      </w:r>
-      <w:r>
-        <w:t xml:space="preserve">generation and automatic verification. Semester work will add bounded repair and</w:t>
-      </w:r>
-      <w:r>
-        <w:t xml:space="preserve"> </w:t>
-      </w:r>
-      <w:r>
-        <w:t xml:space="preserve">compare it with this control on additional RTL tasks. Synthesis/PPA feedback is a</w:t>
-      </w:r>
-      <w:r>
-        <w:t xml:space="preserve"> </w:t>
-      </w:r>
-      <w:r>
-        <w:t xml:space="preserve">stretch goal. Physical design, SoC generation, and formal verification are outside</w:t>
-      </w:r>
-      <w:r>
-        <w:t xml:space="preserve"> </w:t>
-      </w:r>
-      <w:r>
-        <w:t xml:space="preserve">the initial scope.</w:t>
+        <w:t xml:space="preserve">Generated RTL can contain syntax, timing, and functional errors. Compiler</w:t>
+      </w:r>
+      <w:r>
+        <w:t xml:space="preserve"> </w:t>
+      </w:r>
+      <w:r>
+        <w:t xml:space="preserve">diagnostics and simulation mismatches supply objective feedback for an agentic</w:t>
+      </w:r>
+      <w:r>
+        <w:t xml:space="preserve"> </w:t>
+      </w:r>
+      <w:r>
+        <w:t xml:space="preserve">generate–observe–repair workflow. Open-source Icarus Verilog makes evaluation</w:t>
+      </w:r>
+      <w:r>
+        <w:t xml:space="preserve"> </w:t>
+      </w:r>
+      <w:r>
+        <w:t xml:space="preserve">feasible within a semester. Implemented now: one-shot generation and automated</w:t>
+      </w:r>
+      <w:r>
+        <w:t xml:space="preserve"> </w:t>
+      </w:r>
+      <w:r>
+        <w:t xml:space="preserve">verification. Planned: bounded repair and comparison on additional RTL tasks.</w:t>
+      </w:r>
+      <w:r>
+        <w:t xml:space="preserve"> </w:t>
+      </w:r>
+      <w:r>
+        <w:t xml:space="preserve">Synthesis/PPA feedback is a stretch goal; physical design and SoC-scale generation</w:t>
+      </w:r>
+      <w:r>
+        <w:t xml:space="preserve"> </w:t>
+      </w:r>
+      <w:r>
+        <w:t xml:space="preserve">are outside the initial scope.</w:t>
       </w:r>
     </w:p>
     <w:bookmarkEnd w:id="22"/>
@@ -272,13 +254,25 @@
         <w:pStyle w:val="FirstParagraph"/>
       </w:pPr>
       <w:r>
-        <w:t xml:space="preserve">Python 3.10+ orchestrates an OpenAI-compatible Chat Completions request, saves the</w:t>
-      </w:r>
-      <w:r>
-        <w:t xml:space="preserve"> </w:t>
-      </w:r>
-      <w:r>
-        <w:t xml:space="preserve">generated module, invokes</w:t>
+        <w:t xml:space="preserve">Python 3.10+ makes one OpenAI Chat Completions call to</w:t>
+      </w:r>
+      <w:r>
+        <w:t xml:space="preserve"> </w:t>
+      </w:r>
+      <w:r>
+        <w:rPr>
+          <w:rStyle w:val="VerbatimChar"/>
+        </w:rPr>
+        <w:t xml:space="preserve">gpt-5.6-sol</w:t>
+      </w:r>
+      <w:r>
+        <w:t xml:space="preserve">, cleans and</w:t>
+      </w:r>
+      <w:r>
+        <w:t xml:space="preserve"> </w:t>
+      </w:r>
+      <w:r>
+        <w:t xml:space="preserve">saves the module, compiles with</w:t>
       </w:r>
       <w:r>
         <w:t xml:space="preserve"> </w:t>
@@ -290,7 +284,127 @@
         <w:t xml:space="preserve">iverilog -g2012</w:t>
       </w:r>
       <w:r>
-        <w:t xml:space="preserve">, and executes the independent testbench</w:t>
+        <w:t xml:space="preserve">, and simulates with</w:t>
+      </w:r>
+      <w:r>
+        <w:t xml:space="preserve"> </w:t>
+      </w:r>
+      <w:r>
+        <w:rPr>
+          <w:rStyle w:val="VerbatimChar"/>
+        </w:rPr>
+        <w:t xml:space="preserve">vvp</w:t>
+      </w:r>
+      <w:r>
+        <w:t xml:space="preserve">.</w:t>
+      </w:r>
+      <w:r>
+        <w:t xml:space="preserve"> </w:t>
+      </w:r>
+      <w:r>
+        <w:t xml:space="preserve">The model receives only the specification/interface; the testbench is withheld.</w:t>
+      </w:r>
+      <w:r>
+        <w:t xml:space="preserve"> </w:t>
+      </w:r>
+      <w:r>
+        <w:rPr>
+          <w:rStyle w:val="VerbatimChar"/>
+        </w:rPr>
+        <w:t xml:space="preserve">src/llm_client.py</w:t>
+      </w:r>
+      <w:r>
+        <w:t xml:space="preserve">,</w:t>
+      </w:r>
+      <w:r>
+        <w:t xml:space="preserve"> </w:t>
+      </w:r>
+      <w:r>
+        <w:rPr>
+          <w:rStyle w:val="VerbatimChar"/>
+        </w:rPr>
+        <w:t xml:space="preserve">rtl_generator.py</w:t>
+      </w:r>
+      <w:r>
+        <w:t xml:space="preserve">,</w:t>
+      </w:r>
+      <w:r>
+        <w:t xml:space="preserve"> </w:t>
+      </w:r>
+      <w:r>
+        <w:rPr>
+          <w:rStyle w:val="VerbatimChar"/>
+        </w:rPr>
+        <w:t xml:space="preserve">simulator.py</w:t>
+      </w:r>
+      <w:r>
+        <w:t xml:space="preserve">, and</w:t>
+      </w:r>
+      <w:r>
+        <w:t xml:space="preserve"> </w:t>
+      </w:r>
+      <w:r>
+        <w:rPr>
+          <w:rStyle w:val="VerbatimChar"/>
+        </w:rPr>
+        <w:t xml:space="preserve">baseline.py</w:t>
+      </w:r>
+      <w:r>
+        <w:t xml:space="preserve"> </w:t>
+      </w:r>
+      <w:r>
+        <w:t xml:space="preserve">implement</w:t>
+      </w:r>
+      <w:r>
+        <w:t xml:space="preserve"> </w:t>
+      </w:r>
+      <w:r>
+        <w:t xml:space="preserve">the pipeline. Run</w:t>
+      </w:r>
+      <w:r>
+        <w:t xml:space="preserve"> </w:t>
+      </w:r>
+      <w:r>
+        <w:rPr>
+          <w:rStyle w:val="VerbatimChar"/>
+        </w:rPr>
+        <w:t xml:space="preserve">./scripts/run_baseline.sh</w:t>
+      </w:r>
+      <w:r>
+        <w:t xml:space="preserve">. This one-shot baseline is the</w:t>
+      </w:r>
+      <w:r>
+        <w:t xml:space="preserve"> </w:t>
+      </w:r>
+      <w:r>
+        <w:t xml:space="preserve">experimental control because it cannot incorporate feedback or repair failures.</w:t>
+      </w:r>
+    </w:p>
+    <w:bookmarkEnd w:id="23"/>
+    <w:bookmarkStart w:id="27" w:name="section-4.-test-case-and-baseline-output"/>
+    <w:p>
+      <w:pPr>
+        <w:pStyle w:val="Heading2"/>
+      </w:pPr>
+      <w:r>
+        <w:t xml:space="preserve">Section 4. Test Case and Baseline Output</w:t>
+      </w:r>
+    </w:p>
+    <w:p>
+      <w:pPr>
+        <w:pStyle w:val="FirstParagraph"/>
+      </w:pPr>
+      <w:r>
+        <w:t xml:space="preserve">Input: an 8-bit</w:t>
+      </w:r>
+      <w:r>
+        <w:t xml:space="preserve"> </w:t>
+      </w:r>
+      <w:r>
+        <w:rPr>
+          <w:rStyle w:val="VerbatimChar"/>
+        </w:rPr>
+        <w:t xml:space="preserve">counter</w:t>
       </w:r>
       <w:r>
         <w:t xml:space="preserve"> </w:t>
@@ -305,25 +419,7 @@
         <w:rPr>
           <w:rStyle w:val="VerbatimChar"/>
         </w:rPr>
-        <w:t xml:space="preserve">vvp</w:t>
-      </w:r>
-      <w:r>
-        <w:t xml:space="preserve">. The prompt includes the specification/interface only; the testbench is</w:t>
-      </w:r>
-      <w:r>
-        <w:t xml:space="preserve"> </w:t>
-      </w:r>
-      <w:r>
-        <w:t xml:space="preserve">withheld.</w:t>
-      </w:r>
-      <w:r>
-        <w:t xml:space="preserve"> </w:t>
-      </w:r>
-      <w:r>
-        <w:rPr>
-          <w:rStyle w:val="VerbatimChar"/>
-        </w:rPr>
-        <w:t xml:space="preserve">src/llm_client.py</w:t>
+        <w:t xml:space="preserve">clk</w:t>
       </w:r>
       <w:r>
         <w:t xml:space="preserve">,</w:t>
@@ -335,7 +431,7 @@
         <w:rPr>
           <w:rStyle w:val="VerbatimChar"/>
         </w:rPr>
-        <w:t xml:space="preserve">rtl_generator.py</w:t>
+        <w:t xml:space="preserve">reset</w:t>
       </w:r>
       <w:r>
         <w:t xml:space="preserve">,</w:t>
@@ -347,7 +443,7 @@
         <w:rPr>
           <w:rStyle w:val="VerbatimChar"/>
         </w:rPr>
-        <w:t xml:space="preserve">simulator.py</w:t>
+        <w:t xml:space="preserve">enable</w:t>
       </w:r>
       <w:r>
         <w:t xml:space="preserve">, and</w:t>
@@ -359,37 +455,49 @@
         <w:rPr>
           <w:rStyle w:val="VerbatimChar"/>
         </w:rPr>
-        <w:t xml:space="preserve">baseline.py</w:t>
-      </w:r>
-      <w:r>
-        <w:t xml:space="preserve"> </w:t>
-      </w:r>
-      <w:r>
-        <w:t xml:space="preserve">implement the pipeline. The command is</w:t>
-      </w:r>
-      <w:r>
-        <w:t xml:space="preserve"> </w:t>
-      </w:r>
-      <w:r>
-        <w:rPr>
-          <w:rStyle w:val="VerbatimChar"/>
-        </w:rPr>
-        <w:t xml:space="preserve">./scripts/run_baseline.sh</w:t>
-      </w:r>
-      <w:r>
-        <w:t xml:space="preserve">. One-shot</w:t>
-      </w:r>
-      <w:r>
-        <w:t xml:space="preserve"> </w:t>
-      </w:r>
-      <w:r>
-        <w:t xml:space="preserve">generation is the natural control because it has no opportunity to incorporate</w:t>
-      </w:r>
-      <w:r>
-        <w:t xml:space="preserve"> </w:t>
-      </w:r>
-      <w:r>
-        <w:t xml:space="preserve">verification feedback.</w:t>
+        <w:t xml:space="preserve">count</w:t>
+      </w:r>
+      <w:r>
+        <w:t xml:space="preserve">; rising-edge</w:t>
+      </w:r>
+      <w:r>
+        <w:t xml:space="preserve"> </w:t>
+      </w:r>
+      <w:r>
+        <w:t xml:space="preserve">increments, synchronous reset to zero with priority, hold when disabled, and</w:t>
+      </w:r>
+      <w:r>
+        <w:t xml:space="preserve"> </w:t>
+      </w:r>
+      <w:r>
+        <w:t xml:space="preserve">255-to-0 wrap. The actual generated module uses</w:t>
+      </w:r>
+      <w:r>
+        <w:t xml:space="preserve"> </w:t>
+      </w:r>
+      <w:r>
+        <w:rPr>
+          <w:rStyle w:val="VerbatimChar"/>
+        </w:rPr>
+        <w:t xml:space="preserve">always_ff @(posedge clk)</w:t>
+      </w:r>
+      <w:r>
+        <w:t xml:space="preserve"> </w:t>
+      </w:r>
+      <w:r>
+        <w:t xml:space="preserve">with</w:t>
+      </w:r>
+      <w:r>
+        <w:t xml:space="preserve"> </w:t>
+      </w:r>
+      <w:r>
+        <w:t xml:space="preserve">reset and enabled-increment branches. Two live calls on September 6, 2026 each</w:t>
+      </w:r>
+      <w:r>
+        <w:t xml:space="preserve"> </w:t>
+      </w:r>
+      <w:r>
+        <w:t xml:space="preserve">compiled and simulated successfully:</w:t>
       </w:r>
       <w:r>
         <w:t xml:space="preserve"> </w:t>
@@ -399,543 +507,162 @@
           <w:b/>
           <w:bCs/>
         </w:rPr>
-        <w:t xml:space="preserve">Execution status:</w:t>
-      </w:r>
-      <w:r>
-        <w:t xml:space="preserve"> </w:t>
-      </w:r>
-      <w:r>
-        <w:t xml:space="preserve">the local EDA fixture is verified;</w:t>
-      </w:r>
-      <w:r>
-        <w:t xml:space="preserve"> </w:t>
-      </w:r>
-      <w:r>
-        <w:t xml:space="preserve">the live LLM run is blocked by missing API key/model configuration. No live model</w:t>
-      </w:r>
-      <w:r>
-        <w:t xml:space="preserve"> </w:t>
-      </w:r>
-      <w:r>
-        <w:t xml:space="preserve">result is claimed. The baseline implements no iterative repair.</w:t>
-      </w:r>
-    </w:p>
-    <w:bookmarkEnd w:id="23"/>
-    <w:bookmarkStart w:id="24" w:name="section-4.-test-case-and-baseline-output"/>
-    <w:p>
-      <w:pPr>
-        <w:pStyle w:val="Heading2"/>
-      </w:pPr>
-      <w:r>
-        <w:t xml:space="preserve">Section 4. Test Case and Baseline Output</w:t>
+        <w:t xml:space="preserve">853 checks; TEST_PASS</w:t>
+      </w:r>
+      <w:r>
+        <w:t xml:space="preserve">. Generation took</w:t>
+      </w:r>
+      <w:r>
+        <w:t xml:space="preserve"> </w:t>
+      </w:r>
+      <w:r>
+        <w:t xml:space="preserve">2.645 s initially and 1.942 s in a fresh public clone; each call reported 322 total</w:t>
+      </w:r>
+      <w:r>
+        <w:t xml:space="preserve"> </w:t>
+      </w:r>
+      <w:r>
+        <w:t xml:space="preserve">tokens. These demonstrate reproducibility on one task, not general accuracy.</w:t>
+      </w:r>
+      <w:r>
+        <w:t xml:space="preserve"> </w:t>
+      </w:r>
+      <w:r>
+        <w:rPr>
+          <w:rStyle w:val="VerbatimChar"/>
+        </w:rPr>
+        <w:t xml:space="preserve">generated/counter.sv</w:t>
+      </w:r>
+      <w:r>
+        <w:t xml:space="preserve">,</w:t>
+      </w:r>
+      <w:r>
+        <w:t xml:space="preserve"> </w:t>
+      </w:r>
+      <w:r>
+        <w:rPr>
+          <w:rStyle w:val="VerbatimChar"/>
+        </w:rPr>
+        <w:t xml:space="preserve">results/baseline_results.json</w:t>
+      </w:r>
+      <w:r>
+        <w:t xml:space="preserve">, and</w:t>
+      </w:r>
+      <w:r>
+        <w:t xml:space="preserve"> </w:t>
+      </w:r>
+      <w:r>
+        <w:rPr>
+          <w:rStyle w:val="VerbatimChar"/>
+        </w:rPr>
+        <w:t xml:space="preserve">artifacts/baseline_output.txt</w:t>
+      </w:r>
+      <w:r>
+        <w:t xml:space="preserve"> </w:t>
+      </w:r>
+      <w:r>
+        <w:t xml:space="preserve">preserve the first run;</w:t>
+      </w:r>
+      <w:r>
+        <w:t xml:space="preserve"> </w:t>
+      </w:r>
+      <w:r>
+        <w:rPr>
+          <w:rStyle w:val="VerbatimChar"/>
+        </w:rPr>
+        <w:t xml:space="preserve">reproduction_*</w:t>
+      </w:r>
+      <w:r>
+        <w:t xml:space="preserve"> </w:t>
+      </w:r>
+      <w:r>
+        <w:t xml:space="preserve">results/logs</w:t>
+      </w:r>
+      <w:r>
+        <w:t xml:space="preserve"> </w:t>
+      </w:r>
+      <w:r>
+        <w:t xml:space="preserve">and</w:t>
+      </w:r>
+      <w:r>
+        <w:t xml:space="preserve"> </w:t>
+      </w:r>
+      <w:r>
+        <w:rPr>
+          <w:rStyle w:val="VerbatimChar"/>
+        </w:rPr>
+        <w:t xml:space="preserve">generated/counter_reproduction.sv</w:t>
+      </w:r>
+      <w:r>
+        <w:t xml:space="preserve"> </w:t>
+      </w:r>
+      <w:r>
+        <w:t xml:space="preserve">preserve the second.</w:t>
       </w:r>
     </w:p>
     <w:p>
       <w:pPr>
-        <w:pStyle w:val="FirstParagraph"/>
-      </w:pPr>
-      <w:r>
-        <w:t xml:space="preserve">Input:</w:t>
-      </w:r>
-      <w:r>
-        <w:t xml:space="preserve"> </w:t>
-      </w:r>
-      <w:r>
-        <w:t xml:space="preserve">“Create module</w:t>
-      </w:r>
-      <w:r>
-        <w:t xml:space="preserve"> </w:t>
-      </w:r>
-      <w:r>
-        <w:rPr>
-          <w:rStyle w:val="VerbatimChar"/>
-        </w:rPr>
-        <w:t xml:space="preserve">counter</w:t>
-      </w:r>
-      <w:r>
-        <w:t xml:space="preserve"> </w:t>
-      </w:r>
-      <w:r>
-        <w:t xml:space="preserve">with</w:t>
-      </w:r>
-      <w:r>
-        <w:t xml:space="preserve"> </w:t>
-      </w:r>
-      <w:r>
-        <w:rPr>
-          <w:rStyle w:val="VerbatimChar"/>
-        </w:rPr>
-        <w:t xml:space="preserve">clk</w:t>
-      </w:r>
-      <w:r>
-        <w:t xml:space="preserve">,</w:t>
-      </w:r>
-      <w:r>
-        <w:t xml:space="preserve"> </w:t>
-      </w:r>
-      <w:r>
-        <w:rPr>
-          <w:rStyle w:val="VerbatimChar"/>
-        </w:rPr>
-        <w:t xml:space="preserve">reset</w:t>
-      </w:r>
-      <w:r>
-        <w:t xml:space="preserve">,</w:t>
-      </w:r>
-      <w:r>
-        <w:t xml:space="preserve"> </w:t>
-      </w:r>
-      <w:r>
-        <w:rPr>
-          <w:rStyle w:val="VerbatimChar"/>
-        </w:rPr>
-        <w:t xml:space="preserve">enable</w:t>
-      </w:r>
-      <w:r>
-        <w:t xml:space="preserve">, and 8-bit</w:t>
-      </w:r>
-      <w:r>
-        <w:t xml:space="preserve"> </w:t>
-      </w:r>
-      <w:r>
-        <w:rPr>
-          <w:rStyle w:val="VerbatimChar"/>
-        </w:rPr>
-        <w:t xml:space="preserve">count</w:t>
-      </w:r>
-      <w:r>
-        <w:t xml:space="preserve">;</w:t>
-      </w:r>
-      <w:r>
-        <w:t xml:space="preserve"> </w:t>
-      </w:r>
-      <w:r>
-        <w:t xml:space="preserve">on rising edges reset to zero, otherwise increment when enabled, otherwise hold;</w:t>
-      </w:r>
-      <w:r>
-        <w:t xml:space="preserve"> </w:t>
-      </w:r>
-      <w:r>
-        <w:t xml:space="preserve">wrap 255 to 0.”</w:t>
-      </w:r>
-      <w:r>
-        <w:t xml:space="preserve"> </w:t>
-      </w:r>
-      <w:r>
-        <w:t xml:space="preserve">Reset must be synchronous and take priority. The evaluator makes</w:t>
-      </w:r>
-      <w:r>
-        <w:t xml:space="preserve"> </w:t>
-      </w:r>
-      <w:r>
-        <w:t xml:space="preserve">853 checks, including between-edge stability. Actual hand-written fixture output:</w:t>
-      </w:r>
-      <w:r>
-        <w:t xml:space="preserve"> </w:t>
-      </w:r>
-      <w:r>
-        <w:rPr>
-          <w:rStyle w:val="VerbatimChar"/>
-        </w:rPr>
-        <w:t xml:space="preserve">Compilation: PASS; Simulation: PASS; Checks: 853; TEST_PASS</w:t>
-      </w:r>
-      <w:r>
-        <w:t xml:space="preserve">. Seven faulty RTL</w:t>
-      </w:r>
-      <w:r>
-        <w:t xml:space="preserve"> </w:t>
-      </w:r>
-      <w:r>
-        <w:t xml:space="preserve">variants were rejected, supporting the evaluator’s ability to detect these errors.</w:t>
-      </w:r>
-      <w:r>
-        <w:t xml:space="preserve"> </w:t>
-      </w:r>
-      <w:r>
-        <w:t xml:space="preserve">This fixture is not LLM-generated evidence. The actual live attempt reports</w:t>
-      </w:r>
-      <w:r>
-        <w:t xml:space="preserve"> </w:t>
-      </w:r>
-      <w:r>
-        <w:rPr>
-          <w:rStyle w:val="VerbatimChar"/>
-        </w:rPr>
-        <w:t xml:space="preserve">Model: (not configured); Compilation: NOT RUN; Simulation: NOT RUN; Functional verification: FAIL</w:t>
-      </w:r>
-      <w:r>
-        <w:t xml:space="preserve"> </w:t>
-      </w:r>
-      <w:r>
-        <w:t xml:space="preserve">because credentials/model are absent. See</w:t>
-      </w:r>
-      <w:r>
-        <w:t xml:space="preserve"> </w:t>
-      </w:r>
-      <w:r>
-        <w:rPr>
-          <w:rStyle w:val="VerbatimChar"/>
-        </w:rPr>
-        <w:t xml:space="preserve">results/baseline_results.json</w:t>
-      </w:r>
-      <w:r>
-        <w:t xml:space="preserve"> </w:t>
-      </w:r>
-      <w:r>
-        <w:t xml:space="preserve">and</w:t>
-      </w:r>
-      <w:r>
-        <w:t xml:space="preserve"> </w:t>
-      </w:r>
-      <w:r>
-        <w:rPr>
-          <w:rStyle w:val="VerbatimChar"/>
-        </w:rPr>
-        <w:t xml:space="preserve">artifacts/baseline_output.txt</w:t>
-      </w:r>
-      <w:r>
-        <w:t xml:space="preserve">.</w:t>
-      </w:r>
-      <w:r>
-        <w:t xml:space="preserve"> </w:t>
-      </w:r>
-      <w:r>
-        <w:rPr>
-          <w:b/>
-          <w:bCs/>
-        </w:rPr>
-        <w:t xml:space="preserve">Required screenshot pending:</w:t>
-      </w:r>
-      <w:r>
-        <w:t xml:space="preserve"> </w:t>
-      </w:r>
-      <w:r>
-        <w:rPr>
-          <w:rStyle w:val="VerbatimChar"/>
-        </w:rPr>
-        <w:t xml:space="preserve">artifacts/baseline_screenshot.png</w:t>
-      </w:r>
-      <w:r>
-        <w:t xml:space="preserve"> </w:t>
-      </w:r>
-      <w:r>
-        <w:t xml:space="preserve">must show a</w:t>
-      </w:r>
-      <w:r>
-        <w:t xml:space="preserve"> </w:t>
-      </w:r>
-      <w:r>
-        <w:t xml:space="preserve">successful live run before submission. No generated counter is claimed yet.</w:t>
-      </w:r>
-    </w:p>
-    <w:bookmarkEnd w:id="24"/>
-    <w:bookmarkStart w:id="25" w:name="X5f2a089c1ec1ceb33bd13bd54a987c562746303"/>
-    <w:p>
-      <w:pPr>
-        <w:pStyle w:val="Heading2"/>
-      </w:pPr>
-      <w:r>
-        <w:t xml:space="preserve">Section 5. Reproducibility and Run Instructions</w:t>
+        <w:pStyle w:val="CaptionedFigure"/>
+      </w:pPr>
+      <w:r>
+        <w:drawing>
+          <wp:inline>
+            <wp:extent cx="5669280" cy="3406163"/>
+            <wp:effectExtent b="0" l="0" r="0" t="0"/>
+            <wp:docPr descr="Actual Terminal capture of the fresh-clone run; full-resolution image is in artifacts/baseline_screenshot.png." title="" id="25" name="Picture"/>
+            <a:graphic>
+              <a:graphicData uri="http://schemas.openxmlformats.org/drawingml/2006/picture">
+                <pic:pic>
+                  <pic:nvPicPr>
+                    <pic:cNvPr descr="../artifacts/baseline_screenshot.png" id="26" name="Picture"/>
+                    <pic:cNvPicPr>
+                      <a:picLocks noChangeArrowheads="1" noChangeAspect="1"/>
+                    </pic:cNvPicPr>
+                  </pic:nvPicPr>
+                  <pic:blipFill>
+                    <a:blip r:embed="rId24"/>
+                    <a:stretch>
+                      <a:fillRect/>
+                    </a:stretch>
+                  </pic:blipFill>
+                  <pic:spPr bwMode="auto">
+                    <a:xfrm>
+                      <a:off x="0" y="0"/>
+                      <a:ext cx="5669280" cy="3406163"/>
+                    </a:xfrm>
+                    <a:prstGeom prst="rect">
+                      <a:avLst/>
+                    </a:prstGeom>
+                    <a:noFill/>
+                    <a:ln w="9525">
+                      <a:noFill/>
+                      <a:headEnd/>
+                      <a:tailEnd/>
+                    </a:ln>
+                  </pic:spPr>
+                </pic:pic>
+              </a:graphicData>
+            </a:graphic>
+          </wp:inline>
+        </w:drawing>
       </w:r>
     </w:p>
     <w:p>
       <w:pPr>
-        <w:pStyle w:val="FirstParagraph"/>
-      </w:pPr>
-      <w:r>
-        <w:t xml:space="preserve">Clone the public repository and enter</w:t>
-      </w:r>
-      <w:r>
-        <w:t xml:space="preserve"> </w:t>
-      </w:r>
-      <w:r>
-        <w:rPr>
-          <w:rStyle w:val="VerbatimChar"/>
-        </w:rPr>
-        <w:t xml:space="preserve">rtlrepair-agent</w:t>
-      </w:r>
-      <w:r>
-        <w:t xml:space="preserve">. Install Python 3.10+ and</w:t>
-      </w:r>
-      <w:r>
-        <w:t xml:space="preserve"> </w:t>
-      </w:r>
-      <w:r>
-        <w:t xml:space="preserve">Icarus Verilog (</w:t>
-      </w:r>
-      <w:r>
-        <w:rPr>
-          <w:rStyle w:val="VerbatimChar"/>
-        </w:rPr>
-        <w:t xml:space="preserve">brew install icarus-verilog</w:t>
-      </w:r>
-      <w:r>
-        <w:t xml:space="preserve"> </w:t>
-      </w:r>
-      <w:r>
-        <w:t xml:space="preserve">on macOS;</w:t>
-      </w:r>
-      <w:r>
-        <w:t xml:space="preserve"> </w:t>
-      </w:r>
-      <w:r>
-        <w:rPr>
-          <w:rStyle w:val="VerbatimChar"/>
-        </w:rPr>
-        <w:t xml:space="preserve">sudo apt-get install iverilog python3-venv</w:t>
-      </w:r>
-      <w:r>
-        <w:t xml:space="preserve"> </w:t>
-      </w:r>
-      <w:r>
-        <w:t xml:space="preserve">on Ubuntu). Run</w:t>
-      </w:r>
-      <w:r>
-        <w:t xml:space="preserve"> </w:t>
-      </w:r>
-      <w:r>
-        <w:rPr>
-          <w:rStyle w:val="VerbatimChar"/>
-        </w:rPr>
-        <w:t xml:space="preserve">python3 -m venv .venv</w:t>
-      </w:r>
-      <w:r>
-        <w:t xml:space="preserve">,</w:t>
-      </w:r>
-      <w:r>
-        <w:t xml:space="preserve"> </w:t>
-      </w:r>
-      <w:r>
-        <w:rPr>
-          <w:rStyle w:val="VerbatimChar"/>
-        </w:rPr>
-        <w:t xml:space="preserve">source .venv/bin/activate</w:t>
-      </w:r>
-      <w:r>
-        <w:t xml:space="preserve">, and</w:t>
-      </w:r>
-      <w:r>
-        <w:t xml:space="preserve"> </w:t>
-      </w:r>
-      <w:r>
-        <w:rPr>
-          <w:rStyle w:val="VerbatimChar"/>
-        </w:rPr>
-        <w:t xml:space="preserve">python -m pip install -r requirements.txt</w:t>
-      </w:r>
-      <w:r>
-        <w:t xml:space="preserve"> </w:t>
-      </w:r>
-      <w:r>
-        <w:t xml:space="preserve">(no</w:t>
-      </w:r>
-      <w:r>
-        <w:t xml:space="preserve"> </w:t>
-      </w:r>
-      <w:r>
-        <w:t xml:space="preserve">third-party Python packages). Copy</w:t>
-      </w:r>
-      <w:r>
-        <w:t xml:space="preserve"> </w:t>
-      </w:r>
-      <w:r>
-        <w:rPr>
-          <w:rStyle w:val="VerbatimChar"/>
-        </w:rPr>
-        <w:t xml:space="preserve">.env.example</w:t>
-      </w:r>
-      <w:r>
-        <w:t xml:space="preserve"> </w:t>
-      </w:r>
-      <w:r>
-        <w:t xml:space="preserve">to</w:t>
-      </w:r>
-      <w:r>
-        <w:t xml:space="preserve"> </w:t>
-      </w:r>
-      <w:r>
-        <w:rPr>
-          <w:rStyle w:val="VerbatimChar"/>
-        </w:rPr>
-        <w:t xml:space="preserve">.env</w:t>
-      </w:r>
-      <w:r>
-        <w:t xml:space="preserve">; set</w:t>
-      </w:r>
-      <w:r>
-        <w:t xml:space="preserve"> </w:t>
-      </w:r>
-      <w:r>
-        <w:rPr>
-          <w:rStyle w:val="VerbatimChar"/>
-        </w:rPr>
-        <w:t xml:space="preserve">OPENAI_API_KEY</w:t>
-      </w:r>
-      <w:r>
-        <w:t xml:space="preserve"> </w:t>
-      </w:r>
-      <w:r>
-        <w:t xml:space="preserve">and</w:t>
-      </w:r>
-      <w:r>
-        <w:t xml:space="preserve"> </w:t>
-      </w:r>
-      <w:r>
-        <w:rPr>
-          <w:rStyle w:val="VerbatimChar"/>
-        </w:rPr>
-        <w:t xml:space="preserve">OPENAI_MODEL</w:t>
-      </w:r>
-      <w:r>
-        <w:t xml:space="preserve"> </w:t>
-      </w:r>
-      <w:r>
-        <w:t xml:space="preserve">to an accessible model.</w:t>
-      </w:r>
-      <w:r>
-        <w:t xml:space="preserve"> </w:t>
-      </w:r>
-      <w:r>
-        <w:rPr>
-          <w:rStyle w:val="VerbatimChar"/>
-        </w:rPr>
-        <w:t xml:space="preserve">OPENAI_BASE_URL</w:t>
-      </w:r>
-      <w:r>
-        <w:t xml:space="preserve"> </w:t>
-      </w:r>
-      <w:r>
-        <w:t xml:space="preserve">is optional and</w:t>
-      </w:r>
-      <w:r>
-        <w:t xml:space="preserve"> </w:t>
-      </w:r>
-      <w:r>
-        <w:t xml:space="preserve">defaults to OpenAI’s</w:t>
-      </w:r>
-      <w:r>
-        <w:t xml:space="preserve"> </w:t>
-      </w:r>
-      <w:r>
-        <w:rPr>
-          <w:rStyle w:val="VerbatimChar"/>
-        </w:rPr>
-        <w:t xml:space="preserve">/v1</w:t>
-      </w:r>
-      <w:r>
-        <w:t xml:space="preserve"> </w:t>
-      </w:r>
-      <w:r>
-        <w:t xml:space="preserve">API root. Run</w:t>
-      </w:r>
-      <w:r>
-        <w:t xml:space="preserve"> </w:t>
-      </w:r>
-      <w:r>
-        <w:rPr>
-          <w:rStyle w:val="VerbatimChar"/>
-        </w:rPr>
-        <w:t xml:space="preserve">./scripts/run_baseline.sh</w:t>
-      </w:r>
-      <w:r>
-        <w:t xml:space="preserve">.</w:t>
-      </w:r>
-      <w:r>
-        <w:t xml:space="preserve"> </w:t>
-      </w:r>
-      <w:r>
-        <w:t xml:space="preserve">Inputs are</w:t>
-      </w:r>
-      <w:r>
-        <w:t xml:space="preserve"> </w:t>
-      </w:r>
-      <w:r>
-        <w:rPr>
-          <w:rStyle w:val="VerbatimChar"/>
-        </w:rPr>
-        <w:t xml:space="preserve">examples/counter/spec.txt</w:t>
-      </w:r>
-      <w:r>
-        <w:t xml:space="preserve"> </w:t>
-      </w:r>
-      <w:r>
-        <w:t xml:space="preserve">and</w:t>
-      </w:r>
-      <w:r>
-        <w:t xml:space="preserve"> </w:t>
-      </w:r>
-      <w:r>
-        <w:rPr>
-          <w:rStyle w:val="VerbatimChar"/>
-        </w:rPr>
-        <w:t xml:space="preserve">tb.sv</w:t>
-      </w:r>
-      <w:r>
-        <w:t xml:space="preserve">. Outputs are</w:t>
-      </w:r>
-      <w:r>
-        <w:t xml:space="preserve"> </w:t>
-      </w:r>
-      <w:r>
-        <w:rPr>
-          <w:rStyle w:val="VerbatimChar"/>
-        </w:rPr>
-        <w:t xml:space="preserve">generated/counter.sv</w:t>
-      </w:r>
-      <w:r>
-        <w:t xml:space="preserve">,</w:t>
-      </w:r>
-      <w:r>
-        <w:t xml:space="preserve"> </w:t>
-      </w:r>
-      <w:r>
-        <w:rPr>
-          <w:rStyle w:val="VerbatimChar"/>
-        </w:rPr>
-        <w:t xml:space="preserve">results/baseline_results.json</w:t>
-      </w:r>
-      <w:r>
-        <w:t xml:space="preserve">, and</w:t>
-      </w:r>
-      <w:r>
-        <w:t xml:space="preserve"> </w:t>
-      </w:r>
-      <w:r>
-        <w:rPr>
-          <w:rStyle w:val="VerbatimChar"/>
-        </w:rPr>
-        <w:t xml:space="preserve">artifacts/baseline_output.txt</w:t>
-      </w:r>
-      <w:r>
-        <w:t xml:space="preserve">. Configuration is loaded automatically; no secrets</w:t>
-      </w:r>
-      <w:r>
-        <w:t xml:space="preserve"> </w:t>
-      </w:r>
-      <w:r>
-        <w:t xml:space="preserve">are committed. API access is required; no success is guaranteed. Offline tests:</w:t>
-      </w:r>
-      <w:r>
-        <w:t xml:space="preserve"> </w:t>
-      </w:r>
-      <w:r>
-        <w:rPr>
-          <w:rStyle w:val="VerbatimChar"/>
-        </w:rPr>
-        <w:t xml:space="preserve">python -m unittest discover -s tests -v</w:t>
-      </w:r>
-      <w:r>
-        <w:t xml:space="preserve">.</w:t>
+        <w:pStyle w:val="ImageCaption"/>
+      </w:pPr>
+      <w:r>
+        <w:t xml:space="preserve">Actual Terminal capture of the fresh-clone run; full-resolution image is in artifacts/baseline_screenshot.png.</w:t>
       </w:r>
     </w:p>
-    <w:bookmarkEnd w:id="25"/>
-    <w:bookmarkStart w:id="26" w:name="section-6.-initial-evaluation-plan"/>
+    <w:bookmarkEnd w:id="27"/>
+    <w:bookmarkStart w:id="28" w:name="X5f2a089c1ec1ceb33bd13bd54a987c562746303"/>
     <w:p>
       <w:pPr>
         <w:pStyle w:val="Heading2"/>
       </w:pPr>
       <w:r>
-        <w:t xml:space="preserve">Section 6. Initial Evaluation Plan</w:t>
+        <w:t xml:space="preserve">Section 5. Reproducibility and Run Instructions</w:t>
       </w:r>
     </w:p>
     <w:p>
@@ -943,59 +670,224 @@
         <w:pStyle w:val="FirstParagraph"/>
       </w:pPr>
       <w:r>
-        <w:t xml:space="preserve">Compare one-shot generation with verification-guided repair using the same model,</w:t>
-      </w:r>
-      <w:r>
-        <w:t xml:space="preserve"> </w:t>
-      </w:r>
-      <w:r>
-        <w:t xml:space="preserve">initial prompt, tasks, and independent testbenches. Set a repair-call limit and</w:t>
-      </w:r>
-      <w:r>
-        <w:t xml:space="preserve"> </w:t>
-      </w:r>
-      <w:r>
-        <w:t xml:space="preserve">report both single-call performance and improvement per additional call; include</w:t>
-      </w:r>
-      <w:r>
-        <w:t xml:space="preserve"> </w:t>
-      </w:r>
-      <w:r>
-        <w:t xml:space="preserve">budget-matched independent resampling to separate feedback benefit from extra</w:t>
-      </w:r>
-      <w:r>
-        <w:t xml:space="preserve"> </w:t>
-      </w:r>
-      <w:r>
-        <w:t xml:space="preserve">compute. Primary metric: functional pass rate across tasks and repeated trials.</w:t>
-      </w:r>
-      <w:r>
-        <w:t xml:space="preserve"> </w:t>
-      </w:r>
-      <w:r>
-        <w:t xml:space="preserve">Secondary metrics: compilation rate, iterations, LLM calls, token usage, latency,</w:t>
-      </w:r>
-      <w:r>
-        <w:t xml:space="preserve"> </w:t>
-      </w:r>
-      <w:r>
-        <w:t xml:space="preserve">and measurable API cost. Begin with curated small modules; consider VerilogEval</w:t>
-      </w:r>
-      <w:r>
-        <w:t xml:space="preserve"> </w:t>
-      </w:r>
-      <w:r>
-        <w:t xml:space="preserve">and RTLLM later. Keep failed runs and report all trials.</w:t>
+        <w:t xml:space="preserve">Clone the repository above and enter</w:t>
+      </w:r>
+      <w:r>
+        <w:t xml:space="preserve"> </w:t>
+      </w:r>
+      <w:r>
+        <w:rPr>
+          <w:rStyle w:val="VerbatimChar"/>
+        </w:rPr>
+        <w:t xml:space="preserve">rtlrepair-agent</w:t>
+      </w:r>
+      <w:r>
+        <w:t xml:space="preserve">. Install Python 3.10+ and</w:t>
+      </w:r>
+      <w:r>
+        <w:t xml:space="preserve"> </w:t>
+      </w:r>
+      <w:r>
+        <w:t xml:space="preserve">Icarus Verilog (</w:t>
+      </w:r>
+      <w:r>
+        <w:rPr>
+          <w:rStyle w:val="VerbatimChar"/>
+        </w:rPr>
+        <w:t xml:space="preserve">brew install icarus-verilog</w:t>
+      </w:r>
+      <w:r>
+        <w:t xml:space="preserve"> </w:t>
+      </w:r>
+      <w:r>
+        <w:t xml:space="preserve">on macOS). Run</w:t>
+      </w:r>
+      <w:r>
+        <w:t xml:space="preserve"> </w:t>
+      </w:r>
+      <w:r>
+        <w:rPr>
+          <w:rStyle w:val="VerbatimChar"/>
+        </w:rPr>
+        <w:t xml:space="preserve">python3 -m venv .venv</w:t>
+      </w:r>
+      <w:r>
+        <w:t xml:space="preserve">,</w:t>
+      </w:r>
+      <w:r>
+        <w:t xml:space="preserve"> </w:t>
+      </w:r>
+      <w:r>
+        <w:rPr>
+          <w:rStyle w:val="VerbatimChar"/>
+        </w:rPr>
+        <w:t xml:space="preserve">source .venv/bin/activate</w:t>
+      </w:r>
+      <w:r>
+        <w:t xml:space="preserve">, and</w:t>
+      </w:r>
+      <w:r>
+        <w:t xml:space="preserve"> </w:t>
+      </w:r>
+      <w:r>
+        <w:rPr>
+          <w:rStyle w:val="VerbatimChar"/>
+        </w:rPr>
+        <w:t xml:space="preserve">python -m pip install -r requirements.txt</w:t>
+      </w:r>
+      <w:r>
+        <w:t xml:space="preserve"> </w:t>
+      </w:r>
+      <w:r>
+        <w:t xml:space="preserve">(standard library only). Copy</w:t>
+      </w:r>
+      <w:r>
+        <w:t xml:space="preserve"> </w:t>
+      </w:r>
+      <w:r>
+        <w:rPr>
+          <w:rStyle w:val="VerbatimChar"/>
+        </w:rPr>
+        <w:t xml:space="preserve">.env.example</w:t>
+      </w:r>
+      <w:r>
+        <w:t xml:space="preserve"> </w:t>
+      </w:r>
+      <w:r>
+        <w:t xml:space="preserve">to</w:t>
+      </w:r>
+      <w:r>
+        <w:t xml:space="preserve"> </w:t>
+      </w:r>
+      <w:r>
+        <w:rPr>
+          <w:rStyle w:val="VerbatimChar"/>
+        </w:rPr>
+        <w:t xml:space="preserve">.env</w:t>
+      </w:r>
+      <w:r>
+        <w:t xml:space="preserve">; fill</w:t>
+      </w:r>
+      <w:r>
+        <w:t xml:space="preserve"> </w:t>
+      </w:r>
+      <w:r>
+        <w:rPr>
+          <w:rStyle w:val="VerbatimChar"/>
+        </w:rPr>
+        <w:t xml:space="preserve">OPENAI_API_KEY</w:t>
+      </w:r>
+      <w:r>
+        <w:t xml:space="preserve"> </w:t>
+      </w:r>
+      <w:r>
+        <w:t xml:space="preserve">and</w:t>
+      </w:r>
+      <w:r>
+        <w:t xml:space="preserve"> </w:t>
+      </w:r>
+      <w:r>
+        <w:t xml:space="preserve">retain</w:t>
+      </w:r>
+      <w:r>
+        <w:t xml:space="preserve"> </w:t>
+      </w:r>
+      <w:r>
+        <w:rPr>
+          <w:rStyle w:val="VerbatimChar"/>
+        </w:rPr>
+        <w:t xml:space="preserve">OPENAI_MODEL=gpt-5.6-sol</w:t>
+      </w:r>
+      <w:r>
+        <w:t xml:space="preserve">. Leave optional</w:t>
+      </w:r>
+      <w:r>
+        <w:t xml:space="preserve"> </w:t>
+      </w:r>
+      <w:r>
+        <w:rPr>
+          <w:rStyle w:val="VerbatimChar"/>
+        </w:rPr>
+        <w:t xml:space="preserve">OPENAI_BASE_URL</w:t>
+      </w:r>
+      <w:r>
+        <w:t xml:space="preserve"> </w:t>
+      </w:r>
+      <w:r>
+        <w:t xml:space="preserve">blank for</w:t>
+      </w:r>
+      <w:r>
+        <w:t xml:space="preserve"> </w:t>
+      </w:r>
+      <w:r>
+        <w:rPr>
+          <w:rStyle w:val="VerbatimChar"/>
+        </w:rPr>
+        <w:t xml:space="preserve">https://api.openai.com/v1</w:t>
+      </w:r>
+      <w:r>
+        <w:t xml:space="preserve">. Run</w:t>
+      </w:r>
+      <w:r>
+        <w:t xml:space="preserve"> </w:t>
+      </w:r>
+      <w:r>
+        <w:rPr>
+          <w:rStyle w:val="VerbatimChar"/>
+        </w:rPr>
+        <w:t xml:space="preserve">./scripts/run_baseline.sh</w:t>
+      </w:r>
+      <w:r>
+        <w:t xml:space="preserve">. Inputs are</w:t>
+      </w:r>
+      <w:r>
+        <w:t xml:space="preserve"> </w:t>
+      </w:r>
+      <w:r>
+        <w:rPr>
+          <w:rStyle w:val="VerbatimChar"/>
+        </w:rPr>
+        <w:t xml:space="preserve">examples/counter/spec.txt</w:t>
+      </w:r>
+      <w:r>
+        <w:t xml:space="preserve"> </w:t>
+      </w:r>
+      <w:r>
+        <w:t xml:space="preserve">and</w:t>
+      </w:r>
+      <w:r>
+        <w:t xml:space="preserve"> </w:t>
+      </w:r>
+      <w:r>
+        <w:rPr>
+          <w:rStyle w:val="VerbatimChar"/>
+        </w:rPr>
+        <w:t xml:space="preserve">examples/counter/tb.sv</w:t>
+      </w:r>
+      <w:r>
+        <w:t xml:space="preserve">; outputs are listed above.</w:t>
+      </w:r>
+      <w:r>
+        <w:t xml:space="preserve"> </w:t>
+      </w:r>
+      <w:r>
+        <w:t xml:space="preserve">API access and model availability are required. README includes Linux setup and</w:t>
+      </w:r>
+      <w:r>
+        <w:t xml:space="preserve"> </w:t>
+      </w:r>
+      <w:r>
+        <w:t xml:space="preserve">offline testing; 17 tests pass.</w:t>
       </w:r>
     </w:p>
-    <w:bookmarkEnd w:id="26"/>
-    <w:bookmarkStart w:id="27" w:name="section-7.-limitations-and-next-steps"/>
+    <w:bookmarkEnd w:id="28"/>
+    <w:bookmarkStart w:id="29" w:name="section-6.-initial-evaluation-plan"/>
     <w:p>
       <w:pPr>
         <w:pStyle w:val="Heading2"/>
       </w:pPr>
       <w:r>
-        <w:t xml:space="preserve">Section 7. Limitations and Next Steps</w:t>
+        <w:t xml:space="preserve">Section 6. Initial Evaluation Plan</w:t>
       </w:r>
     </w:p>
     <w:p>
@@ -1003,46 +895,82 @@
         <w:pStyle w:val="FirstParagraph"/>
       </w:pPr>
       <w:r>
-        <w:t xml:space="preserve">One example cannot establish generality. Correctness depends on testbench coverage;</w:t>
-      </w:r>
-      <w:r>
-        <w:t xml:space="preserve"> </w:t>
-      </w:r>
-      <w:r>
-        <w:t xml:space="preserve">simulation cannot guarantee untested behavior or synthesizability. Model</w:t>
-      </w:r>
-      <w:r>
-        <w:t xml:space="preserve"> </w:t>
-      </w:r>
-      <w:r>
-        <w:t xml:space="preserve">nondeterminism and API dependency affect repeatability. The current system cannot</w:t>
-      </w:r>
-      <w:r>
-        <w:t xml:space="preserve"> </w:t>
-      </w:r>
-      <w:r>
-        <w:t xml:space="preserve">repair errors, and live generation remains unverified. Immediate steps are to</w:t>
-      </w:r>
-      <w:r>
-        <w:t xml:space="preserve"> </w:t>
-      </w:r>
-      <w:r>
-        <w:t xml:space="preserve">configure the API, run and preserve the live result, capture its screenshot, and</w:t>
-      </w:r>
-      <w:r>
-        <w:t xml:space="preserve"> </w:t>
-      </w:r>
-      <w:r>
-        <w:t xml:space="preserve">update this proposal with observed model/results. Then implement failure diagnosis,</w:t>
-      </w:r>
-      <w:r>
-        <w:t xml:space="preserve"> </w:t>
-      </w:r>
-      <w:r>
-        <w:t xml:space="preserve">bounded repair, broader evaluation, and optional synthesis/PPA feedback.</w:t>
+        <w:t xml:space="preserve">Compare one-shot generation with bounded verification-guided repair using the</w:t>
+      </w:r>
+      <w:r>
+        <w:t xml:space="preserve"> </w:t>
+      </w:r>
+      <w:r>
+        <w:t xml:space="preserve">same model, initial prompt, tasks, and independent testbenches across repeated</w:t>
+      </w:r>
+      <w:r>
+        <w:t xml:space="preserve"> </w:t>
+      </w:r>
+      <w:r>
+        <w:t xml:space="preserve">trials. Primary metric: functional pass rate. Also measure compilation rate,</w:t>
+      </w:r>
+      <w:r>
+        <w:t xml:space="preserve"> </w:t>
+      </w:r>
+      <w:r>
+        <w:t xml:space="preserve">iterations, calls, tokens, latency, and measurable cost. Include budget-matched</w:t>
+      </w:r>
+      <w:r>
+        <w:t xml:space="preserve"> </w:t>
+      </w:r>
+      <w:r>
+        <w:t xml:space="preserve">independent resampling to distinguish feedback benefit from extra calls. Start</w:t>
+      </w:r>
+      <w:r>
+        <w:t xml:space="preserve"> </w:t>
+      </w:r>
+      <w:r>
+        <w:t xml:space="preserve">with curated modules; consider VerilogEval and RTLLM later. Retain all failures.</w:t>
       </w:r>
     </w:p>
-    <w:bookmarkEnd w:id="27"/>
+    <w:bookmarkEnd w:id="29"/>
+    <w:bookmarkStart w:id="30" w:name="section-7.-limitations-and-next-steps"/>
+    <w:p>
+      <w:pPr>
+        <w:pStyle w:val="Heading2"/>
+      </w:pPr>
+      <w:r>
+        <w:t xml:space="preserve">Section 7. Limitations and Next Steps</w:t>
+      </w:r>
+    </w:p>
+    <w:p>
+      <w:pPr>
+        <w:pStyle w:val="FirstParagraph"/>
+      </w:pPr>
+      <w:r>
+        <w:t xml:space="preserve">One counter cannot establish generality. Simulation checks only covered behavior</w:t>
+      </w:r>
+      <w:r>
+        <w:t xml:space="preserve"> </w:t>
+      </w:r>
+      <w:r>
+        <w:t xml:space="preserve">and does not prove synthesizability. Model nondeterminism, API availability, and</w:t>
+      </w:r>
+      <w:r>
+        <w:t xml:space="preserve"> </w:t>
+      </w:r>
+      <w:r>
+        <w:t xml:space="preserve">testbench coverage limit repeatability and correctness. The baseline cannot repair</w:t>
+      </w:r>
+      <w:r>
+        <w:t xml:space="preserve"> </w:t>
+      </w:r>
+      <w:r>
+        <w:t xml:space="preserve">errors. Next: implement failure diagnosis and bounded repair, expand the task set,</w:t>
+      </w:r>
+      <w:r>
+        <w:t xml:space="preserve"> </w:t>
+      </w:r>
+      <w:r>
+        <w:t xml:space="preserve">and evaluate against the control; optionally add synthesis/PPA feedback.</w:t>
+      </w:r>
+    </w:p>
+    <w:bookmarkEnd w:id="30"/>
     <w:sectPr>
       <w:pgSz w:h="15840" w:w="12240"/>
       <w:pgMar w:bottom="1440" w:footer="720" w:gutter="0" w:header="720" w:left="1440" w:right="1440" w:top="1440"/>

</xml_diff>

<commit_message>
Fit Word proposal to two pages and verify final submission checklist
</commit_message>
<xml_diff>
--- a/proposal/capstone_proposal.docx
+++ b/proposal/capstone_proposal.docx
@@ -973,7 +973,7 @@
     <w:bookmarkEnd w:id="30"/>
     <w:sectPr>
       <w:pgSz w:h="15840" w:w="12240"/>
-      <w:pgMar w:bottom="1440" w:footer="720" w:gutter="0" w:header="720" w:left="1440" w:right="1440" w:top="1440"/>
+      <w:pgMar w:bottom="1152" w:footer="720" w:gutter="0" w:header="720" w:left="1152" w:right="1152" w:top="1152"/>
       <w:cols w:space="720"/>
     </w:sectPr>
   </w:body>
@@ -1645,6 +1645,13 @@
   <w:style w:default="1" w:styleId="Normal" w:type="paragraph">
     <w:name w:val="Normal"/>
     <w:qFormat/>
+    <w:rPr>
+      <w:sz w:val="22"/>
+      <w:szCs w:val="22"/>
+    </w:rPr>
+    <w:pPr>
+      <w:spacing w:before="0" w:after="60" w:line="240" w:lineRule="auto"/>
+    </w:pPr>
   </w:style>
   <w:style w:styleId="Heading1" w:type="paragraph">
     <w:name w:val="heading 1"/>
@@ -1677,7 +1684,7 @@
     <w:pPr>
       <w:keepNext/>
       <w:keepLines/>
-      <w:spacing w:after="0" w:before="200"/>
+      <w:spacing w:after="60" w:before="100" w:line="240" w:lineRule="auto"/>
       <w:outlineLvl w:val="1"/>
     </w:pPr>
     <w:rPr>
@@ -1685,8 +1692,8 @@
       <w:b/>
       <w:bCs/>
       <w:color w:themeColor="accent1" w:val="4F81BD"/>
-      <w:sz w:val="28"/>
-      <w:szCs w:val="28"/>
+      <w:sz w:val="24"/>
+      <w:szCs w:val="24"/>
     </w:rPr>
   </w:style>
   <w:style w:styleId="Heading3" w:type="paragraph">
@@ -1852,14 +1859,25 @@
     <w:basedOn w:val="Normal"/>
     <w:qFormat/>
     <w:pPr>
-      <w:spacing w:after="180" w:before="180"/>
+      <w:spacing w:after="60" w:before="0" w:line="240" w:lineRule="auto"/>
     </w:pPr>
+    <w:rPr>
+      <w:sz w:val="22"/>
+      <w:szCs w:val="22"/>
+    </w:rPr>
   </w:style>
   <w:style w:customStyle="1" w:styleId="FirstParagraph" w:type="paragraph">
     <w:name w:val="First Paragraph"/>
     <w:basedOn w:val="BodyText"/>
     <w:next w:val="BodyText"/>
     <w:qFormat/>
+    <w:rPr>
+      <w:sz w:val="22"/>
+      <w:szCs w:val="22"/>
+    </w:rPr>
+    <w:pPr>
+      <w:spacing w:before="0" w:after="60" w:line="240" w:lineRule="auto"/>
+    </w:pPr>
   </w:style>
   <w:style w:customStyle="1" w:styleId="Compact" w:type="paragraph">
     <w:name w:val="Compact"/>
@@ -2030,10 +2048,12 @@
     <w:basedOn w:val="Normal"/>
     <w:link w:val="CaptionChar"/>
     <w:pPr>
-      <w:spacing w:after="120"/>
+      <w:spacing w:after="60" w:before="0" w:line="240" w:lineRule="auto"/>
     </w:pPr>
     <w:rPr>
       <w:i/>
+      <w:sz w:val="22"/>
+      <w:szCs w:val="22"/>
     </w:rPr>
   </w:style>
   <w:style w:customStyle="1" w:styleId="TableCaption" w:type="paragraph">
@@ -2046,6 +2066,13 @@
   <w:style w:customStyle="1" w:styleId="ImageCaption" w:type="paragraph">
     <w:name w:val="Image Caption"/>
     <w:basedOn w:val="Caption"/>
+    <w:rPr>
+      <w:sz w:val="22"/>
+      <w:szCs w:val="22"/>
+    </w:rPr>
+    <w:pPr>
+      <w:spacing w:before="0" w:after="60" w:line="240" w:lineRule="auto"/>
+    </w:pPr>
   </w:style>
   <w:style w:customStyle="1" w:styleId="Figure" w:type="paragraph">
     <w:name w:val="Figure"/>

</xml_diff>

<commit_message>
Add independently verified FIFO and pin one-shot baseline to GPT-4.1
</commit_message>
<xml_diff>
--- a/proposal/capstone_proposal.docx
+++ b/proposal/capstone_proposal.docx
@@ -101,7 +101,7 @@
         <w:rPr>
           <w:rStyle w:val="VerbatimChar"/>
         </w:rPr>
-        <w:t xml:space="preserve">examples/counter/</w:t>
+        <w:t xml:space="preserve">examples/</w:t>
       </w:r>
       <w:r>
         <w:t xml:space="preserve">.</w:t>
@@ -122,25 +122,25 @@
         <w:pStyle w:val="FirstParagraph"/>
       </w:pPr>
       <w:r>
-        <w:t xml:space="preserve">For an RTL designer, convert a natural-language hardware specification and fixed</w:t>
-      </w:r>
-      <w:r>
-        <w:t xml:space="preserve"> </w:t>
-      </w:r>
-      <w:r>
-        <w:t xml:space="preserve">module interface into synthesizable SystemVerilog. An external testbench evaluates</w:t>
-      </w:r>
-      <w:r>
-        <w:t xml:space="preserve"> </w:t>
-      </w:r>
-      <w:r>
-        <w:t xml:space="preserve">the output. Success requires compilation and simulation exit codes of zero, an</w:t>
-      </w:r>
-      <w:r>
-        <w:t xml:space="preserve"> </w:t>
-      </w:r>
-      <w:r>
-        <w:t xml:space="preserve">explicit</w:t>
+        <w:t xml:space="preserve">For an RTL designer, convert a natural-language specification and fixed module</w:t>
+      </w:r>
+      <w:r>
+        <w:t xml:space="preserve"> </w:t>
+      </w:r>
+      <w:r>
+        <w:t xml:space="preserve">interface into synthesizable SystemVerilog. An independent testbench evaluates</w:t>
+      </w:r>
+      <w:r>
+        <w:t xml:space="preserve"> </w:t>
+      </w:r>
+      <w:r>
+        <w:t xml:space="preserve">the output. Success requires compilation and simulation exit codes of zero,</w:t>
+      </w:r>
+      <w:r>
+        <w:t xml:space="preserve"> </w:t>
+      </w:r>
+      <w:r>
+        <w:t xml:space="preserve">an explicit</w:t>
       </w:r>
       <w:r>
         <w:t xml:space="preserve"> </w:t>
@@ -170,19 +170,13 @@
         <w:t xml:space="preserve"> </w:t>
       </w:r>
       <w:r>
-        <w:t xml:space="preserve">functional mismatches, and missing pass markers are failures. Research question:</w:t>
-      </w:r>
-      <w:r>
-        <w:t xml:space="preserve"> </w:t>
-      </w:r>
-      <w:r>
-        <w:t xml:space="preserve">can an LLM using compiler/simulator feedback achieve a higher functional pass rate</w:t>
-      </w:r>
-      <w:r>
-        <w:t xml:space="preserve"> </w:t>
-      </w:r>
-      <w:r>
-        <w:t xml:space="preserve">than one-shot generation?</w:t>
+        <w:t xml:space="preserve">mismatches, and missing pass markers are failures. Research question: can compiler</w:t>
+      </w:r>
+      <w:r>
+        <w:t xml:space="preserve"> </w:t>
+      </w:r>
+      <w:r>
+        <w:t xml:space="preserve">and simulator feedback improve an LLM’s functional pass rate over one-shot generation?</w:t>
       </w:r>
     </w:p>
     <w:bookmarkEnd w:id="21"/>
@@ -206,7 +200,7 @@
         <w:t xml:space="preserve"> </w:t>
       </w:r>
       <w:r>
-        <w:t xml:space="preserve">diagnostics and simulation mismatches supply objective feedback for an agentic</w:t>
+        <w:t xml:space="preserve">diagnostics and simulation mismatches provide objective feedback for an agentic</w:t>
       </w:r>
       <w:r>
         <w:t xml:space="preserve"> </w:t>
@@ -224,19 +218,19 @@
         <w:t xml:space="preserve"> </w:t>
       </w:r>
       <w:r>
-        <w:t xml:space="preserve">verification. Planned: bounded repair and comparison on additional RTL tasks.</w:t>
-      </w:r>
-      <w:r>
-        <w:t xml:space="preserve"> </w:t>
-      </w:r>
-      <w:r>
-        <w:t xml:space="preserve">Synthesis/PPA feedback is a stretch goal; physical design and SoC-scale generation</w:t>
-      </w:r>
-      <w:r>
-        <w:t xml:space="preserve"> </w:t>
-      </w:r>
-      <w:r>
-        <w:t xml:space="preserve">are outside the initial scope.</w:t>
+        <w:t xml:space="preserve">verification on a counter and FIFO. Planned: bounded repair and broader</w:t>
+      </w:r>
+      <w:r>
+        <w:t xml:space="preserve"> </w:t>
+      </w:r>
+      <w:r>
+        <w:t xml:space="preserve">evaluation. Synthesis/PPA feedback is a stretch goal; physical design is outside</w:t>
+      </w:r>
+      <w:r>
+        <w:t xml:space="preserve"> </w:t>
+      </w:r>
+      <w:r>
+        <w:t xml:space="preserve">the initial scope.</w:t>
       </w:r>
     </w:p>
     <w:bookmarkEnd w:id="22"/>
@@ -254,25 +248,28 @@
         <w:pStyle w:val="FirstParagraph"/>
       </w:pPr>
       <w:r>
-        <w:t xml:space="preserve">Python 3.10+ makes one OpenAI Chat Completions call to</w:t>
-      </w:r>
-      <w:r>
-        <w:t xml:space="preserve"> </w:t>
-      </w:r>
-      <w:r>
-        <w:rPr>
-          <w:rStyle w:val="VerbatimChar"/>
-        </w:rPr>
-        <w:t xml:space="preserve">gpt-5.6-sol</w:t>
-      </w:r>
-      <w:r>
-        <w:t xml:space="preserve">, cleans and</w:t>
-      </w:r>
-      <w:r>
-        <w:t xml:space="preserve"> </w:t>
-      </w:r>
-      <w:r>
-        <w:t xml:space="preserve">saves the module, compiles with</w:t>
+        <w:t xml:space="preserve">Python 3.10+ calls OpenAI’s pinned</w:t>
+      </w:r>
+      <w:r>
+        <w:t xml:space="preserve"> </w:t>
+      </w:r>
+      <w:r>
+        <w:rPr>
+          <w:rStyle w:val="VerbatimChar"/>
+        </w:rPr>
+        <w:t xml:space="preserve">gpt-4.1-2025-04-14</w:t>
+      </w:r>
+      <w:r>
+        <w:t xml:space="preserve"> </w:t>
+      </w:r>
+      <w:r>
+        <w:t xml:space="preserve">snapshot once per design,</w:t>
+      </w:r>
+      <w:r>
+        <w:t xml:space="preserve"> </w:t>
+      </w:r>
+      <w:r>
+        <w:t xml:space="preserve">cleans/saves the response, compiles with</w:t>
       </w:r>
       <w:r>
         <w:t xml:space="preserve"> </w:t>
@@ -296,13 +293,7 @@
         <w:t xml:space="preserve">vvp</w:t>
       </w:r>
       <w:r>
-        <w:t xml:space="preserve">.</w:t>
-      </w:r>
-      <w:r>
-        <w:t xml:space="preserve"> </w:t>
-      </w:r>
-      <w:r>
-        <w:t xml:space="preserve">The model receives only the specification/interface; the testbench is withheld.</w:t>
+        <w:t xml:space="preserve">. The model sees only the specification/interface; testbenches are withheld.</w:t>
       </w:r>
       <w:r>
         <w:t xml:space="preserve"> </w:t>
@@ -359,25 +350,28 @@
         <w:t xml:space="preserve"> </w:t>
       </w:r>
       <w:r>
-        <w:t xml:space="preserve">the pipeline. Run</w:t>
-      </w:r>
-      <w:r>
-        <w:t xml:space="preserve"> </w:t>
-      </w:r>
-      <w:r>
-        <w:rPr>
-          <w:rStyle w:val="VerbatimChar"/>
-        </w:rPr>
-        <w:t xml:space="preserve">./scripts/run_baseline.sh</w:t>
-      </w:r>
-      <w:r>
-        <w:t xml:space="preserve">. This one-shot baseline is the</w:t>
-      </w:r>
-      <w:r>
-        <w:t xml:space="preserve"> </w:t>
-      </w:r>
-      <w:r>
-        <w:t xml:space="preserve">experimental control because it cannot incorporate feedback or repair failures.</w:t>
+        <w:t xml:space="preserve">the pipeline.</w:t>
+      </w:r>
+      <w:r>
+        <w:t xml:space="preserve"> </w:t>
+      </w:r>
+      <w:r>
+        <w:rPr>
+          <w:rStyle w:val="VerbatimChar"/>
+        </w:rPr>
+        <w:t xml:space="preserve">./scripts/run_examples.sh</w:t>
+      </w:r>
+      <w:r>
+        <w:t xml:space="preserve"> </w:t>
+      </w:r>
+      <w:r>
+        <w:t xml:space="preserve">runs both tasks with two calls total.</w:t>
+      </w:r>
+      <w:r>
+        <w:t xml:space="preserve"> </w:t>
+      </w:r>
+      <w:r>
+        <w:t xml:space="preserve">This control baseline performs no feedback-driven repair or automatic retry.</w:t>
       </w:r>
     </w:p>
     <w:bookmarkEnd w:id="23"/>
@@ -395,109 +389,45 @@
         <w:pStyle w:val="FirstParagraph"/>
       </w:pPr>
       <w:r>
-        <w:t xml:space="preserve">Input: an 8-bit</w:t>
-      </w:r>
-      <w:r>
-        <w:t xml:space="preserve"> </w:t>
-      </w:r>
-      <w:r>
-        <w:rPr>
-          <w:rStyle w:val="VerbatimChar"/>
-        </w:rPr>
-        <w:t xml:space="preserve">counter</w:t>
-      </w:r>
-      <w:r>
-        <w:t xml:space="preserve"> </w:t>
-      </w:r>
-      <w:r>
-        <w:t xml:space="preserve">with</w:t>
-      </w:r>
-      <w:r>
-        <w:t xml:space="preserve"> </w:t>
-      </w:r>
-      <w:r>
-        <w:rPr>
-          <w:rStyle w:val="VerbatimChar"/>
-        </w:rPr>
-        <w:t xml:space="preserve">clk</w:t>
-      </w:r>
-      <w:r>
-        <w:t xml:space="preserve">,</w:t>
-      </w:r>
-      <w:r>
-        <w:t xml:space="preserve"> </w:t>
-      </w:r>
-      <w:r>
-        <w:rPr>
-          <w:rStyle w:val="VerbatimChar"/>
-        </w:rPr>
-        <w:t xml:space="preserve">reset</w:t>
-      </w:r>
-      <w:r>
-        <w:t xml:space="preserve">,</w:t>
-      </w:r>
-      <w:r>
-        <w:t xml:space="preserve"> </w:t>
-      </w:r>
-      <w:r>
-        <w:rPr>
-          <w:rStyle w:val="VerbatimChar"/>
-        </w:rPr>
-        <w:t xml:space="preserve">enable</w:t>
-      </w:r>
-      <w:r>
-        <w:t xml:space="preserve">, and</w:t>
-      </w:r>
-      <w:r>
-        <w:t xml:space="preserve"> </w:t>
-      </w:r>
-      <w:r>
-        <w:rPr>
-          <w:rStyle w:val="VerbatimChar"/>
-        </w:rPr>
-        <w:t xml:space="preserve">count</w:t>
-      </w:r>
-      <w:r>
-        <w:t xml:space="preserve">; rising-edge</w:t>
-      </w:r>
-      <w:r>
-        <w:t xml:space="preserve"> </w:t>
-      </w:r>
-      <w:r>
-        <w:t xml:space="preserve">increments, synchronous reset to zero with priority, hold when disabled, and</w:t>
-      </w:r>
-      <w:r>
-        <w:t xml:space="preserve"> </w:t>
-      </w:r>
-      <w:r>
-        <w:t xml:space="preserve">255-to-0 wrap. The actual generated module uses</w:t>
-      </w:r>
-      <w:r>
-        <w:t xml:space="preserve"> </w:t>
-      </w:r>
-      <w:r>
-        <w:rPr>
-          <w:rStyle w:val="VerbatimChar"/>
-        </w:rPr>
-        <w:t xml:space="preserve">always_ff @(posedge clk)</w:t>
-      </w:r>
-      <w:r>
-        <w:t xml:space="preserve"> </w:t>
-      </w:r>
-      <w:r>
-        <w:t xml:space="preserve">with</w:t>
-      </w:r>
-      <w:r>
-        <w:t xml:space="preserve"> </w:t>
-      </w:r>
-      <w:r>
-        <w:t xml:space="preserve">reset and enabled-increment branches. Two live calls on September 6, 2026 each</w:t>
-      </w:r>
-      <w:r>
-        <w:t xml:space="preserve"> </w:t>
-      </w:r>
-      <w:r>
-        <w:t xml:space="preserve">compiled and simulated successfully:</w:t>
+        <w:t xml:space="preserve">The counter checks synchronous reset, enable/hold, and 8-bit wrap. The more complex</w:t>
+      </w:r>
+      <w:r>
+        <w:t xml:space="preserve"> </w:t>
+      </w:r>
+      <w:r>
+        <w:t xml:space="preserve">FIFO stores sixteen 8-bit words, with registered reads, occupancy/full/empty,</w:t>
+      </w:r>
+      <w:r>
+        <w:t xml:space="preserve"> </w:t>
+      </w:r>
+      <w:r>
+        <w:t xml:space="preserve">ordering, and pointer wrap. At full, simultaneous read/write accepts both; at</w:t>
+      </w:r>
+      <w:r>
+        <w:t xml:space="preserve"> </w:t>
+      </w:r>
+      <w:r>
+        <w:t xml:space="preserve">empty it accepts only the write, with no bypass. An independent shift-queue</w:t>
+      </w:r>
+      <w:r>
+        <w:t xml:space="preserve"> </w:t>
+      </w:r>
+      <w:r>
+        <w:t xml:space="preserve">scoreboard checks directed boundaries and 512 deterministic stimulus cycles.</w:t>
+      </w:r>
+    </w:p>
+    <w:p>
+      <w:pPr>
+        <w:pStyle w:val="BodyText"/>
+      </w:pPr>
+      <w:r>
+        <w:t xml:space="preserve">Actual first GPT-4.1 results on September 6, 2026: both designs compiled, simulated,</w:t>
+      </w:r>
+      <w:r>
+        <w:t xml:space="preserve"> </w:t>
+      </w:r>
+      <w:r>
+        <w:t xml:space="preserve">and emitted</w:t>
       </w:r>
       <w:r>
         <w:t xml:space="preserve"> </w:t>
@@ -507,31 +437,52 @@
           <w:b/>
           <w:bCs/>
         </w:rPr>
-        <w:t xml:space="preserve">853 checks; TEST_PASS</w:t>
-      </w:r>
-      <w:r>
-        <w:t xml:space="preserve">. Generation took</w:t>
-      </w:r>
-      <w:r>
-        <w:t xml:space="preserve"> </w:t>
-      </w:r>
-      <w:r>
-        <w:t xml:space="preserve">2.645 s initially and 1.942 s in a fresh public clone; each call reported 322 total</w:t>
-      </w:r>
-      <w:r>
-        <w:t xml:space="preserve"> </w:t>
-      </w:r>
-      <w:r>
-        <w:t xml:space="preserve">tokens. These demonstrate reproducibility on one task, not general accuracy.</w:t>
-      </w:r>
-      <w:r>
-        <w:t xml:space="preserve"> </w:t>
-      </w:r>
-      <w:r>
-        <w:rPr>
-          <w:rStyle w:val="VerbatimChar"/>
-        </w:rPr>
-        <w:t xml:space="preserve">generated/counter.sv</w:t>
+        <w:t xml:space="preserve">TEST_PASS</w:t>
+      </w:r>
+      <w:r>
+        <w:t xml:space="preserve">. Counter: 853 checks, 1.985 s generation, 329 tokens.</w:t>
+      </w:r>
+      <w:r>
+        <w:t xml:space="preserve"> </w:t>
+      </w:r>
+      <w:r>
+        <w:t xml:space="preserve">FIFO: 744 cycles, 2,233 state checks, 3.478 s generation, 1,099 tokens.</w:t>
+      </w:r>
+      <w:r>
+        <w:t xml:space="preserve"> </w:t>
+      </w:r>
+      <w:r>
+        <w:t xml:space="preserve">Icarus warned that FIFO</w:t>
+      </w:r>
+      <w:r>
+        <w:t xml:space="preserve"> </w:t>
+      </w:r>
+      <w:r>
+        <w:rPr>
+          <w:rStyle w:val="VerbatimChar"/>
+        </w:rPr>
+        <w:t xml:space="preserve">unique case</w:t>
+      </w:r>
+      <w:r>
+        <w:t xml:space="preserve"> </w:t>
+      </w:r>
+      <w:r>
+        <w:t xml:space="preserve">qualities are ignored; compilation exited</w:t>
+      </w:r>
+      <w:r>
+        <w:t xml:space="preserve"> </w:t>
+      </w:r>
+      <w:r>
+        <w:t xml:space="preserve">zero and evaluation passed. Generated RTL was not hand-edited.</w:t>
+      </w:r>
+      <w:r>
+        <w:t xml:space="preserve"> </w:t>
+      </w:r>
+      <w:r>
+        <w:rPr>
+          <w:rStyle w:val="VerbatimChar"/>
+        </w:rPr>
+        <w:t xml:space="preserve">generated/{counter,fifo}.sv</w:t>
       </w:r>
       <w:r>
         <w:t xml:space="preserve">,</w:t>
@@ -543,7 +494,7 @@
         <w:rPr>
           <w:rStyle w:val="VerbatimChar"/>
         </w:rPr>
-        <w:t xml:space="preserve">results/baseline_results.json</w:t>
+        <w:t xml:space="preserve">results/{baseline,fifo}_results.json</w:t>
       </w:r>
       <w:r>
         <w:t xml:space="preserve">, and</w:t>
@@ -555,49 +506,19 @@
         <w:rPr>
           <w:rStyle w:val="VerbatimChar"/>
         </w:rPr>
-        <w:t xml:space="preserve">artifacts/baseline_output.txt</w:t>
-      </w:r>
-      <w:r>
-        <w:t xml:space="preserve"> </w:t>
-      </w:r>
-      <w:r>
-        <w:t xml:space="preserve">preserve the first run;</w:t>
-      </w:r>
-      <w:r>
-        <w:t xml:space="preserve"> </w:t>
-      </w:r>
-      <w:r>
-        <w:rPr>
-          <w:rStyle w:val="VerbatimChar"/>
-        </w:rPr>
-        <w:t xml:space="preserve">reproduction_*</w:t>
-      </w:r>
-      <w:r>
-        <w:t xml:space="preserve"> </w:t>
-      </w:r>
-      <w:r>
-        <w:t xml:space="preserve">results/logs</w:t>
-      </w:r>
-      <w:r>
-        <w:t xml:space="preserve"> </w:t>
-      </w:r>
-      <w:r>
-        <w:t xml:space="preserve">and</w:t>
-      </w:r>
-      <w:r>
-        <w:t xml:space="preserve"> </w:t>
-      </w:r>
-      <w:r>
-        <w:rPr>
-          <w:rStyle w:val="VerbatimChar"/>
-        </w:rPr>
-        <w:t xml:space="preserve">generated/counter_reproduction.sv</w:t>
-      </w:r>
-      <w:r>
-        <w:t xml:space="preserve"> </w:t>
-      </w:r>
-      <w:r>
-        <w:t xml:space="preserve">preserve the second.</w:t>
+        <w:t xml:space="preserve">artifacts/{baseline,fifo}_output.txt</w:t>
+      </w:r>
+      <w:r>
+        <w:t xml:space="preserve"> </w:t>
+      </w:r>
+      <w:r>
+        <w:t xml:space="preserve">preserve the actual outputs.</w:t>
+      </w:r>
+      <w:r>
+        <w:t xml:space="preserve"> </w:t>
+      </w:r>
+      <w:r>
+        <w:t xml:space="preserve">Earlier GPT-5.6 counter evidence is archived separately.</w:t>
       </w:r>
     </w:p>
     <w:p>
@@ -607,9 +528,9 @@
       <w:r>
         <w:drawing>
           <wp:inline>
-            <wp:extent cx="5669280" cy="3406163"/>
+            <wp:extent cx="5669280" cy="3656713"/>
             <wp:effectExtent b="0" l="0" r="0" t="0"/>
-            <wp:docPr descr="Actual Terminal capture of the fresh-clone run; full-resolution image is in artifacts/baseline_screenshot.png." title="" id="25" name="Picture"/>
+            <wp:docPr descr="Genuine Terminal capture: GPT-4.1 FIFO command, verification output, and both task results." title="" id="25" name="Picture"/>
             <a:graphic>
               <a:graphicData uri="http://schemas.openxmlformats.org/drawingml/2006/picture">
                 <pic:pic>
@@ -628,7 +549,7 @@
                   <pic:spPr bwMode="auto">
                     <a:xfrm>
                       <a:off x="0" y="0"/>
-                      <a:ext cx="5669280" cy="3406163"/>
+                      <a:ext cx="5669280" cy="3656713"/>
                     </a:xfrm>
                     <a:prstGeom prst="rect">
                       <a:avLst/>
@@ -652,7 +573,7 @@
         <w:pStyle w:val="ImageCaption"/>
       </w:pPr>
       <w:r>
-        <w:t xml:space="preserve">Actual Terminal capture of the fresh-clone run; full-resolution image is in artifacts/baseline_screenshot.png.</w:t>
+        <w:t xml:space="preserve">Genuine Terminal capture: GPT-4.1 FIFO command, verification output, and both task results.</w:t>
       </w:r>
     </w:p>
     <w:bookmarkEnd w:id="27"/>
@@ -682,13 +603,13 @@
         <w:t xml:space="preserve">rtlrepair-agent</w:t>
       </w:r>
       <w:r>
-        <w:t xml:space="preserve">. Install Python 3.10+ and</w:t>
-      </w:r>
-      <w:r>
-        <w:t xml:space="preserve"> </w:t>
-      </w:r>
-      <w:r>
-        <w:t xml:space="preserve">Icarus Verilog (</w:t>
+        <w:t xml:space="preserve">. Install Python 3.10+</w:t>
+      </w:r>
+      <w:r>
+        <w:t xml:space="preserve"> </w:t>
+      </w:r>
+      <w:r>
+        <w:t xml:space="preserve">and Icarus Verilog (</w:t>
       </w:r>
       <w:r>
         <w:rPr>
@@ -739,7 +660,13 @@
         <w:t xml:space="preserve"> </w:t>
       </w:r>
       <w:r>
-        <w:t xml:space="preserve">(standard library only). Copy</w:t>
+        <w:t xml:space="preserve">(standard library only).</w:t>
+      </w:r>
+      <w:r>
+        <w:t xml:space="preserve"> </w:t>
+      </w:r>
+      <w:r>
+        <w:t xml:space="preserve">Copy</w:t>
       </w:r>
       <w:r>
         <w:t xml:space="preserve"> </w:t>
@@ -781,103 +708,121 @@
         <w:t xml:space="preserve"> </w:t>
       </w:r>
       <w:r>
+        <w:t xml:space="preserve">and retain</w:t>
+      </w:r>
+      <w:r>
+        <w:t xml:space="preserve"> </w:t>
+      </w:r>
+      <w:r>
+        <w:rPr>
+          <w:rStyle w:val="VerbatimChar"/>
+        </w:rPr>
+        <w:t xml:space="preserve">OPENAI_MODEL=gpt-4.1-2025-04-14</w:t>
+      </w:r>
+      <w:r>
+        <w:t xml:space="preserve">. Optional</w:t>
+      </w:r>
+      <w:r>
+        <w:t xml:space="preserve"> </w:t>
+      </w:r>
+      <w:r>
+        <w:rPr>
+          <w:rStyle w:val="VerbatimChar"/>
+        </w:rPr>
+        <w:t xml:space="preserve">OPENAI_BASE_URL</w:t>
+      </w:r>
+      <w:r>
+        <w:t xml:space="preserve"> </w:t>
+      </w:r>
+      <w:r>
+        <w:t xml:space="preserve">defaults to</w:t>
+      </w:r>
+      <w:r>
+        <w:t xml:space="preserve"> </w:t>
+      </w:r>
+      <w:r>
+        <w:rPr>
+          <w:rStyle w:val="VerbatimChar"/>
+        </w:rPr>
+        <w:t xml:space="preserve">https://api.openai.com/v1</w:t>
+      </w:r>
+      <w:r>
+        <w:t xml:space="preserve">. Run</w:t>
+      </w:r>
+      <w:r>
+        <w:t xml:space="preserve"> </w:t>
+      </w:r>
+      <w:r>
+        <w:rPr>
+          <w:rStyle w:val="VerbatimChar"/>
+        </w:rPr>
+        <w:t xml:space="preserve">./scripts/run_examples.sh</w:t>
+      </w:r>
+      <w:r>
+        <w:t xml:space="preserve">, or</w:t>
+      </w:r>
+      <w:r>
+        <w:t xml:space="preserve"> </w:t>
+      </w:r>
+      <w:r>
+        <w:rPr>
+          <w:rStyle w:val="VerbatimChar"/>
+        </w:rPr>
+        <w:t xml:space="preserve">./scripts/run_baseline.sh fifo</w:t>
+      </w:r>
+      <w:r>
+        <w:t xml:space="preserve"> </w:t>
+      </w:r>
+      <w:r>
+        <w:t xml:space="preserve">for FIFO alone. Each</w:t>
+      </w:r>
+      <w:r>
+        <w:t xml:space="preserve"> </w:t>
+      </w:r>
+      <w:r>
+        <w:rPr>
+          <w:rStyle w:val="VerbatimChar"/>
+        </w:rPr>
+        <w:t xml:space="preserve">examples/&lt;task&gt;/</w:t>
+      </w:r>
+      <w:r>
+        <w:t xml:space="preserve"> </w:t>
+      </w:r>
+      <w:r>
+        <w:t xml:space="preserve">contains</w:t>
+      </w:r>
+      <w:r>
+        <w:t xml:space="preserve"> </w:t>
+      </w:r>
+      <w:r>
+        <w:rPr>
+          <w:rStyle w:val="VerbatimChar"/>
+        </w:rPr>
+        <w:t xml:space="preserve">spec.txt</w:t>
+      </w:r>
+      <w:r>
+        <w:t xml:space="preserve"> </w:t>
+      </w:r>
+      <w:r>
         <w:t xml:space="preserve">and</w:t>
       </w:r>
       <w:r>
         <w:t xml:space="preserve"> </w:t>
       </w:r>
       <w:r>
-        <w:t xml:space="preserve">retain</w:t>
-      </w:r>
-      <w:r>
-        <w:t xml:space="preserve"> </w:t>
-      </w:r>
-      <w:r>
-        <w:rPr>
-          <w:rStyle w:val="VerbatimChar"/>
-        </w:rPr>
-        <w:t xml:space="preserve">OPENAI_MODEL=gpt-5.6-sol</w:t>
-      </w:r>
-      <w:r>
-        <w:t xml:space="preserve">. Leave optional</w:t>
-      </w:r>
-      <w:r>
-        <w:t xml:space="preserve"> </w:t>
-      </w:r>
-      <w:r>
-        <w:rPr>
-          <w:rStyle w:val="VerbatimChar"/>
-        </w:rPr>
-        <w:t xml:space="preserve">OPENAI_BASE_URL</w:t>
-      </w:r>
-      <w:r>
-        <w:t xml:space="preserve"> </w:t>
-      </w:r>
-      <w:r>
-        <w:t xml:space="preserve">blank for</w:t>
-      </w:r>
-      <w:r>
-        <w:t xml:space="preserve"> </w:t>
-      </w:r>
-      <w:r>
-        <w:rPr>
-          <w:rStyle w:val="VerbatimChar"/>
-        </w:rPr>
-        <w:t xml:space="preserve">https://api.openai.com/v1</w:t>
-      </w:r>
-      <w:r>
-        <w:t xml:space="preserve">. Run</w:t>
-      </w:r>
-      <w:r>
-        <w:t xml:space="preserve"> </w:t>
-      </w:r>
-      <w:r>
-        <w:rPr>
-          <w:rStyle w:val="VerbatimChar"/>
-        </w:rPr>
-        <w:t xml:space="preserve">./scripts/run_baseline.sh</w:t>
-      </w:r>
-      <w:r>
-        <w:t xml:space="preserve">. Inputs are</w:t>
-      </w:r>
-      <w:r>
-        <w:t xml:space="preserve"> </w:t>
-      </w:r>
-      <w:r>
-        <w:rPr>
-          <w:rStyle w:val="VerbatimChar"/>
-        </w:rPr>
-        <w:t xml:space="preserve">examples/counter/spec.txt</w:t>
-      </w:r>
-      <w:r>
-        <w:t xml:space="preserve"> </w:t>
-      </w:r>
-      <w:r>
-        <w:t xml:space="preserve">and</w:t>
-      </w:r>
-      <w:r>
-        <w:t xml:space="preserve"> </w:t>
-      </w:r>
-      <w:r>
-        <w:rPr>
-          <w:rStyle w:val="VerbatimChar"/>
-        </w:rPr>
-        <w:t xml:space="preserve">examples/counter/tb.sv</w:t>
-      </w:r>
-      <w:r>
-        <w:t xml:space="preserve">; outputs are listed above.</w:t>
-      </w:r>
-      <w:r>
-        <w:t xml:space="preserve"> </w:t>
-      </w:r>
-      <w:r>
-        <w:t xml:space="preserve">API access and model availability are required. README includes Linux setup and</w:t>
-      </w:r>
-      <w:r>
-        <w:t xml:space="preserve"> </w:t>
-      </w:r>
-      <w:r>
-        <w:t xml:space="preserve">offline testing; 17 tests pass.</w:t>
+        <w:rPr>
+          <w:rStyle w:val="VerbatimChar"/>
+        </w:rPr>
+        <w:t xml:space="preserve">tb.sv</w:t>
+      </w:r>
+      <w:r>
+        <w:t xml:space="preserve">; outputs are listed above. API model access is</w:t>
+      </w:r>
+      <w:r>
+        <w:t xml:space="preserve"> </w:t>
+      </w:r>
+      <w:r>
+        <w:t xml:space="preserve">required. README supplies Linux setup and offline verification; 20 tests pass.</w:t>
       </w:r>
     </w:p>
     <w:bookmarkEnd w:id="28"/>
@@ -901,13 +846,13 @@
         <w:t xml:space="preserve"> </w:t>
       </w:r>
       <w:r>
-        <w:t xml:space="preserve">same model, initial prompt, tasks, and independent testbenches across repeated</w:t>
-      </w:r>
-      <w:r>
-        <w:t xml:space="preserve"> </w:t>
-      </w:r>
-      <w:r>
-        <w:t xml:space="preserve">trials. Primary metric: functional pass rate. Also measure compilation rate,</w:t>
+        <w:t xml:space="preserve">same model, initial prompt, tasks, and independent testbenches over repeated</w:t>
+      </w:r>
+      <w:r>
+        <w:t xml:space="preserve"> </w:t>
+      </w:r>
+      <w:r>
+        <w:t xml:space="preserve">trials. Primary metric: functional pass rate. Also measure compile rate,</w:t>
       </w:r>
       <w:r>
         <w:t xml:space="preserve"> </w:t>
@@ -919,13 +864,13 @@
         <w:t xml:space="preserve"> </w:t>
       </w:r>
       <w:r>
-        <w:t xml:space="preserve">independent resampling to distinguish feedback benefit from extra calls. Start</w:t>
-      </w:r>
-      <w:r>
-        <w:t xml:space="preserve"> </w:t>
-      </w:r>
-      <w:r>
-        <w:t xml:space="preserve">with curated modules; consider VerilogEval and RTLLM later. Retain all failures.</w:t>
+        <w:t xml:space="preserve">independent resampling. Expand curated examples before considering VerilogEval</w:t>
+      </w:r>
+      <w:r>
+        <w:t xml:space="preserve"> </w:t>
+      </w:r>
+      <w:r>
+        <w:t xml:space="preserve">or RTLLM. Retain all failed runs.</w:t>
       </w:r>
     </w:p>
     <w:bookmarkEnd w:id="29"/>
@@ -943,31 +888,31 @@
         <w:pStyle w:val="FirstParagraph"/>
       </w:pPr>
       <w:r>
-        <w:t xml:space="preserve">One counter cannot establish generality. Simulation checks only covered behavior</w:t>
-      </w:r>
-      <w:r>
-        <w:t xml:space="preserve"> </w:t>
-      </w:r>
-      <w:r>
-        <w:t xml:space="preserve">and does not prove synthesizability. Model nondeterminism, API availability, and</w:t>
-      </w:r>
-      <w:r>
-        <w:t xml:space="preserve"> </w:t>
-      </w:r>
-      <w:r>
-        <w:t xml:space="preserve">testbench coverage limit repeatability and correctness. The baseline cannot repair</w:t>
-      </w:r>
-      <w:r>
-        <w:t xml:space="preserve"> </w:t>
-      </w:r>
-      <w:r>
-        <w:t xml:space="preserve">errors. Next: implement failure diagnosis and bounded repair, expand the task set,</w:t>
-      </w:r>
-      <w:r>
-        <w:t xml:space="preserve"> </w:t>
-      </w:r>
-      <w:r>
-        <w:t xml:space="preserve">and evaluate against the control; optionally add synthesis/PPA feedback.</w:t>
+        <w:t xml:space="preserve">Two tasks cannot establish generality or a model ranking; state comparisons are</w:t>
+      </w:r>
+      <w:r>
+        <w:t xml:space="preserve"> </w:t>
+      </w:r>
+      <w:r>
+        <w:t xml:space="preserve">not separate design tasks. Simulation covers only tested behavior and does not</w:t>
+      </w:r>
+      <w:r>
+        <w:t xml:space="preserve"> </w:t>
+      </w:r>
+      <w:r>
+        <w:t xml:space="preserve">prove synthesizability. Model nondeterminism, API availability, and testbench</w:t>
+      </w:r>
+      <w:r>
+        <w:t xml:space="preserve"> </w:t>
+      </w:r>
+      <w:r>
+        <w:t xml:space="preserve">coverage limit reliability. Next: implement diagnosis and bounded repair, expand</w:t>
+      </w:r>
+      <w:r>
+        <w:t xml:space="preserve"> </w:t>
+      </w:r>
+      <w:r>
+        <w:t xml:space="preserve">evaluation, and optionally incorporate synthesis/PPA feedback.</w:t>
       </w:r>
     </w:p>
     <w:bookmarkEnd w:id="30"/>

</xml_diff>

<commit_message>
Record GPT-4.1 counter and FIFO public reproduction and completed proposal
</commit_message>
<xml_diff>
--- a/proposal/capstone_proposal.docx
+++ b/proposal/capstone_proposal.docx
@@ -421,13 +421,7 @@
         <w:pStyle w:val="BodyText"/>
       </w:pPr>
       <w:r>
-        <w:t xml:space="preserve">Actual first GPT-4.1 results on September 6, 2026: both designs compiled, simulated,</w:t>
-      </w:r>
-      <w:r>
-        <w:t xml:space="preserve"> </w:t>
-      </w:r>
-      <w:r>
-        <w:t xml:space="preserve">and emitted</w:t>
+        <w:t xml:space="preserve">Both designs compiled, simulated, and emitted</w:t>
       </w:r>
       <w:r>
         <w:t xml:space="preserve"> </w:t>
@@ -440,22 +434,28 @@
         <w:t xml:space="preserve">TEST_PASS</w:t>
       </w:r>
       <w:r>
-        <w:t xml:space="preserve">. Counter: 853 checks, 1.985 s generation, 329 tokens.</w:t>
-      </w:r>
-      <w:r>
-        <w:t xml:space="preserve"> </w:t>
-      </w:r>
-      <w:r>
-        <w:t xml:space="preserve">FIFO: 744 cycles, 2,233 state checks, 3.478 s generation, 1,099 tokens.</w:t>
-      </w:r>
-      <w:r>
-        <w:t xml:space="preserve"> </w:t>
-      </w:r>
-      <w:r>
-        <w:t xml:space="preserve">Icarus warned that FIFO</w:t>
-      </w:r>
-      <w:r>
-        <w:t xml:space="preserve"> </w:t>
+        <w:t xml:space="preserve"> </w:t>
+      </w:r>
+      <w:r>
+        <w:t xml:space="preserve">on September 6, 2026,</w:t>
+      </w:r>
+      <w:r>
+        <w:t xml:space="preserve"> </w:t>
+      </w:r>
+      <w:r>
+        <w:t xml:space="preserve">including fresh-clone reruns. First counter: 853 checks, 1.985 s generation,</w:t>
+      </w:r>
+      <w:r>
+        <w:t xml:space="preserve"> </w:t>
+      </w:r>
+      <w:r>
+        <w:t xml:space="preserve">329 tokens. First FIFO: 744 cycles, 2,233 checks, 3.478 s, 1,099 tokens.</w:t>
+      </w:r>
+      <w:r>
+        <w:t xml:space="preserve"> </w:t>
+      </w:r>
+      <w:r>
+        <w:t xml:space="preserve">FIFO compilation emitted a nonfatal ignored-</w:t>
       </w:r>
       <w:r>
         <w:rPr>
@@ -467,13 +467,7 @@
         <w:t xml:space="preserve"> </w:t>
       </w:r>
       <w:r>
-        <w:t xml:space="preserve">qualities are ignored; compilation exited</w:t>
-      </w:r>
-      <w:r>
-        <w:t xml:space="preserve"> </w:t>
-      </w:r>
-      <w:r>
-        <w:t xml:space="preserve">zero and evaluation passed. Generated RTL was not hand-edited.</w:t>
+        <w:t xml:space="preserve">warning.</w:t>
       </w:r>
       <w:r>
         <w:t xml:space="preserve"> </w:t>
@@ -518,7 +512,7 @@
         <w:t xml:space="preserve"> </w:t>
       </w:r>
       <w:r>
-        <w:t xml:space="preserve">Earlier GPT-5.6 counter evidence is archived separately.</w:t>
+        <w:t xml:space="preserve">Earlier GPT-5.6 evidence is archived.</w:t>
       </w:r>
     </w:p>
     <w:p>
@@ -759,22 +753,7 @@
         <w:t xml:space="preserve">./scripts/run_examples.sh</w:t>
       </w:r>
       <w:r>
-        <w:t xml:space="preserve">, or</w:t>
-      </w:r>
-      <w:r>
-        <w:t xml:space="preserve"> </w:t>
-      </w:r>
-      <w:r>
-        <w:rPr>
-          <w:rStyle w:val="VerbatimChar"/>
-        </w:rPr>
-        <w:t xml:space="preserve">./scripts/run_baseline.sh fifo</w:t>
-      </w:r>
-      <w:r>
-        <w:t xml:space="preserve"> </w:t>
-      </w:r>
-      <w:r>
-        <w:t xml:space="preserve">for FIFO alone. Each</w:t>
+        <w:t xml:space="preserve">. Each</w:t>
       </w:r>
       <w:r>
         <w:t xml:space="preserve"> </w:t>

</xml_diff>

<commit_message>
Make proposal concise with readable lists and consistent pagination
</commit_message>
<xml_diff>
--- a/proposal/capstone_proposal.docx
+++ b/proposal/capstone_proposal.docx
@@ -122,25 +122,89 @@
         <w:pStyle w:val="FirstParagraph"/>
       </w:pPr>
       <w:r>
-        <w:t xml:space="preserve">For an RTL designer, convert a natural-language specification and fixed module</w:t>
-      </w:r>
-      <w:r>
-        <w:t xml:space="preserve"> </w:t>
-      </w:r>
-      <w:r>
-        <w:t xml:space="preserve">interface into synthesizable SystemVerilog. An independent testbench evaluates</w:t>
-      </w:r>
-      <w:r>
-        <w:t xml:space="preserve"> </w:t>
-      </w:r>
-      <w:r>
-        <w:t xml:space="preserve">the output. Success requires compilation and simulation exit codes of zero,</w:t>
-      </w:r>
-      <w:r>
-        <w:t xml:space="preserve"> </w:t>
-      </w:r>
-      <w:r>
-        <w:t xml:space="preserve">an explicit</w:t>
+        <w:rPr>
+          <w:b/>
+          <w:bCs/>
+        </w:rPr>
+        <w:t xml:space="preserve">Research question:</w:t>
+      </w:r>
+      <w:r>
+        <w:t xml:space="preserve"> </w:t>
+      </w:r>
+      <w:r>
+        <w:t xml:space="preserve">Can compiler and simulator feedback improve RTL generation</w:t>
+      </w:r>
+      <w:r>
+        <w:t xml:space="preserve"> </w:t>
+      </w:r>
+      <w:r>
+        <w:t xml:space="preserve">over a one-shot LLM baseline?</w:t>
+      </w:r>
+    </w:p>
+    <w:p>
+      <w:pPr>
+        <w:pStyle w:val="Compact"/>
+        <w:numPr>
+          <w:ilvl w:val="0"/>
+          <w:numId w:val="1001"/>
+        </w:numPr>
+      </w:pPr>
+      <w:r>
+        <w:rPr>
+          <w:b/>
+          <w:bCs/>
+        </w:rPr>
+        <w:t xml:space="preserve">User/task:</w:t>
+      </w:r>
+      <w:r>
+        <w:t xml:space="preserve"> </w:t>
+      </w:r>
+      <w:r>
+        <w:t xml:space="preserve">Help RTL designers turn a natural-language specification and fixed interface into synthesizable SystemVerilog.</w:t>
+      </w:r>
+    </w:p>
+    <w:p>
+      <w:pPr>
+        <w:pStyle w:val="Compact"/>
+        <w:numPr>
+          <w:ilvl w:val="0"/>
+          <w:numId w:val="1001"/>
+        </w:numPr>
+      </w:pPr>
+      <w:r>
+        <w:rPr>
+          <w:b/>
+          <w:bCs/>
+        </w:rPr>
+        <w:t xml:space="preserve">Evaluation:</w:t>
+      </w:r>
+      <w:r>
+        <w:t xml:space="preserve"> </w:t>
+      </w:r>
+      <w:r>
+        <w:t xml:space="preserve">An independent testbench checks the generated RTL.</w:t>
+      </w:r>
+    </w:p>
+    <w:p>
+      <w:pPr>
+        <w:pStyle w:val="Compact"/>
+        <w:numPr>
+          <w:ilvl w:val="0"/>
+          <w:numId w:val="1001"/>
+        </w:numPr>
+      </w:pPr>
+      <w:r>
+        <w:rPr>
+          <w:b/>
+          <w:bCs/>
+        </w:rPr>
+        <w:t xml:space="preserve">Pass:</w:t>
+      </w:r>
+      <w:r>
+        <w:t xml:space="preserve"> </w:t>
+      </w:r>
+      <w:r>
+        <w:t xml:space="preserve">Compilation and simulation exit zero; output includes</w:t>
       </w:r>
       <w:r>
         <w:t xml:space="preserve"> </w:t>
@@ -152,7 +216,10 @@
         <w:t xml:space="preserve">TEST_PASS</w:t>
       </w:r>
       <w:r>
-        <w:t xml:space="preserve">, and no</w:t>
+        <w:t xml:space="preserve"> </w:t>
+      </w:r>
+      <w:r>
+        <w:t xml:space="preserve">and no</w:t>
       </w:r>
       <w:r>
         <w:t xml:space="preserve"> </w:t>
@@ -164,19 +231,7 @@
         <w:t xml:space="preserve">TEST_FAIL</w:t>
       </w:r>
       <w:r>
-        <w:t xml:space="preserve">. Syntax/interface errors, timeouts,</w:t>
-      </w:r>
-      <w:r>
-        <w:t xml:space="preserve"> </w:t>
-      </w:r>
-      <w:r>
-        <w:t xml:space="preserve">mismatches, and missing pass markers are failures. Research question: can compiler</w:t>
-      </w:r>
-      <w:r>
-        <w:t xml:space="preserve"> </w:t>
-      </w:r>
-      <w:r>
-        <w:t xml:space="preserve">and simulator feedback improve an LLM’s functional pass rate over one-shot generation?</w:t>
+        <w:t xml:space="preserve">. Errors, timeouts, mismatches, or missing pass markers fail.</w:t>
       </w:r>
     </w:p>
     <w:bookmarkEnd w:id="21"/>
@@ -194,43 +249,79 @@
         <w:pStyle w:val="FirstParagraph"/>
       </w:pPr>
       <w:r>
-        <w:t xml:space="preserve">Generated RTL can contain syntax, timing, and functional errors. Compiler</w:t>
-      </w:r>
-      <w:r>
-        <w:t xml:space="preserve"> </w:t>
-      </w:r>
-      <w:r>
-        <w:t xml:space="preserve">diagnostics and simulation mismatches provide objective feedback for an agentic</w:t>
-      </w:r>
-      <w:r>
-        <w:t xml:space="preserve"> </w:t>
-      </w:r>
-      <w:r>
-        <w:t xml:space="preserve">generate–observe–repair workflow. Open-source Icarus Verilog makes evaluation</w:t>
-      </w:r>
-      <w:r>
-        <w:t xml:space="preserve"> </w:t>
-      </w:r>
-      <w:r>
-        <w:t xml:space="preserve">feasible within a semester. Implemented now: one-shot generation and automated</w:t>
-      </w:r>
-      <w:r>
-        <w:t xml:space="preserve"> </w:t>
-      </w:r>
-      <w:r>
-        <w:t xml:space="preserve">verification on a counter and FIFO. Planned: bounded repair and broader</w:t>
-      </w:r>
-      <w:r>
-        <w:t xml:space="preserve"> </w:t>
-      </w:r>
-      <w:r>
-        <w:t xml:space="preserve">evaluation. Synthesis/PPA feedback is a stretch goal; physical design is outside</w:t>
-      </w:r>
-      <w:r>
-        <w:t xml:space="preserve"> </w:t>
-      </w:r>
-      <w:r>
-        <w:t xml:space="preserve">the initial scope.</w:t>
+        <w:t xml:space="preserve">Generated RTL can contain syntax, timing, and functional errors. Open-source</w:t>
+      </w:r>
+      <w:r>
+        <w:t xml:space="preserve"> </w:t>
+      </w:r>
+      <w:r>
+        <w:t xml:space="preserve">Icarus Verilog provides objective feedback for a generate–verify–repair workflow.</w:t>
+      </w:r>
+    </w:p>
+    <w:p>
+      <w:pPr>
+        <w:pStyle w:val="Compact"/>
+        <w:numPr>
+          <w:ilvl w:val="0"/>
+          <w:numId w:val="1002"/>
+        </w:numPr>
+      </w:pPr>
+      <w:r>
+        <w:rPr>
+          <w:b/>
+          <w:bCs/>
+        </w:rPr>
+        <w:t xml:space="preserve">Implemented:</w:t>
+      </w:r>
+      <w:r>
+        <w:t xml:space="preserve"> </w:t>
+      </w:r>
+      <w:r>
+        <w:t xml:space="preserve">One-shot generation and automated verification on two designs.</w:t>
+      </w:r>
+    </w:p>
+    <w:p>
+      <w:pPr>
+        <w:pStyle w:val="Compact"/>
+        <w:numPr>
+          <w:ilvl w:val="0"/>
+          <w:numId w:val="1002"/>
+        </w:numPr>
+      </w:pPr>
+      <w:r>
+        <w:rPr>
+          <w:b/>
+          <w:bCs/>
+        </w:rPr>
+        <w:t xml:space="preserve">Semester work:</w:t>
+      </w:r>
+      <w:r>
+        <w:t xml:space="preserve"> </w:t>
+      </w:r>
+      <w:r>
+        <w:t xml:space="preserve">Bounded repair and broader benchmark evaluation.</w:t>
+      </w:r>
+    </w:p>
+    <w:p>
+      <w:pPr>
+        <w:pStyle w:val="Compact"/>
+        <w:numPr>
+          <w:ilvl w:val="0"/>
+          <w:numId w:val="1002"/>
+        </w:numPr>
+      </w:pPr>
+      <w:r>
+        <w:rPr>
+          <w:b/>
+          <w:bCs/>
+        </w:rPr>
+        <w:t xml:space="preserve">Stretch goal:</w:t>
+      </w:r>
+      <w:r>
+        <w:t xml:space="preserve"> </w:t>
+      </w:r>
+      <w:r>
+        <w:t xml:space="preserve">Synthesis/PPA feedback; physical design is outside the initial scope.</w:t>
       </w:r>
     </w:p>
     <w:bookmarkEnd w:id="22"/>
@@ -245,10 +336,85 @@
     </w:p>
     <w:p>
       <w:pPr>
+        <w:pStyle w:val="Compact"/>
+        <w:numPr>
+          <w:ilvl w:val="0"/>
+          <w:numId w:val="1003"/>
+        </w:numPr>
+      </w:pPr>
+      <w:r>
+        <w:t xml:space="preserve">Python calls</w:t>
+      </w:r>
+      <w:r>
+        <w:t xml:space="preserve"> </w:t>
+      </w:r>
+      <w:r>
+        <w:rPr>
+          <w:rStyle w:val="VerbatimChar"/>
+        </w:rPr>
+        <w:t xml:space="preserve">gpt-4.1-2025-04-14</w:t>
+      </w:r>
+      <w:r>
+        <w:t xml:space="preserve"> </w:t>
+      </w:r>
+      <w:r>
+        <w:t xml:space="preserve">once per design using only the specification/interface; the testbench is withheld.</w:t>
+      </w:r>
+    </w:p>
+    <w:p>
+      <w:pPr>
+        <w:pStyle w:val="Compact"/>
+        <w:numPr>
+          <w:ilvl w:val="0"/>
+          <w:numId w:val="1003"/>
+        </w:numPr>
+      </w:pPr>
+      <w:r>
+        <w:t xml:space="preserve">Save RTL, compile with</w:t>
+      </w:r>
+      <w:r>
+        <w:t xml:space="preserve"> </w:t>
+      </w:r>
+      <w:r>
+        <w:rPr>
+          <w:rStyle w:val="VerbatimChar"/>
+        </w:rPr>
+        <w:t xml:space="preserve">iverilog -g2012</w:t>
+      </w:r>
+      <w:r>
+        <w:t xml:space="preserve">, and simulate with</w:t>
+      </w:r>
+      <w:r>
+        <w:t xml:space="preserve"> </w:t>
+      </w:r>
+      <w:r>
+        <w:rPr>
+          <w:rStyle w:val="VerbatimChar"/>
+        </w:rPr>
+        <w:t xml:space="preserve">vvp</w:t>
+      </w:r>
+      <w:r>
+        <w:t xml:space="preserve">.</w:t>
+      </w:r>
+    </w:p>
+    <w:p>
+      <w:pPr>
+        <w:pStyle w:val="Compact"/>
+        <w:numPr>
+          <w:ilvl w:val="0"/>
+          <w:numId w:val="1003"/>
+        </w:numPr>
+      </w:pPr>
+      <w:r>
+        <w:t xml:space="preserve">Report PASS/FAIL and save RTL, logs, timings, token usage, and JSON results.</w:t>
+      </w:r>
+    </w:p>
+    <w:p>
+      <w:pPr>
         <w:pStyle w:val="FirstParagraph"/>
       </w:pPr>
       <w:r>
-        <w:t xml:space="preserve">Python 3.10+ calls OpenAI’s pinned</w:t>
+        <w:t xml:space="preserve">Source:</w:t>
       </w:r>
       <w:r>
         <w:t xml:space="preserve"> </w:t>
@@ -257,171 +423,16 @@
         <w:rPr>
           <w:rStyle w:val="VerbatimChar"/>
         </w:rPr>
-        <w:t xml:space="preserve">gpt-4.1-2025-04-14</w:t>
-      </w:r>
-      <w:r>
-        <w:t xml:space="preserve"> </w:t>
-      </w:r>
-      <w:r>
-        <w:t xml:space="preserve">snapshot once per design,</w:t>
-      </w:r>
-      <w:r>
-        <w:t xml:space="preserve"> </w:t>
-      </w:r>
-      <w:r>
-        <w:t xml:space="preserve">cleans/saves the response, compiles with</w:t>
-      </w:r>
-      <w:r>
-        <w:t xml:space="preserve"> </w:t>
-      </w:r>
-      <w:r>
-        <w:rPr>
-          <w:rStyle w:val="VerbatimChar"/>
-        </w:rPr>
-        <w:t xml:space="preserve">iverilog -g2012</w:t>
-      </w:r>
-      <w:r>
-        <w:t xml:space="preserve">, and simulates with</w:t>
-      </w:r>
-      <w:r>
-        <w:t xml:space="preserve"> </w:t>
-      </w:r>
-      <w:r>
-        <w:rPr>
-          <w:rStyle w:val="VerbatimChar"/>
-        </w:rPr>
-        <w:t xml:space="preserve">vvp</w:t>
-      </w:r>
-      <w:r>
-        <w:t xml:space="preserve">. The model sees only the specification/interface; testbenches are withheld.</w:t>
-      </w:r>
-      <w:r>
-        <w:t xml:space="preserve"> </w:t>
-      </w:r>
-      <w:r>
-        <w:rPr>
-          <w:rStyle w:val="VerbatimChar"/>
-        </w:rPr>
-        <w:t xml:space="preserve">src/llm_client.py</w:t>
-      </w:r>
-      <w:r>
-        <w:t xml:space="preserve">,</w:t>
-      </w:r>
-      <w:r>
-        <w:t xml:space="preserve"> </w:t>
-      </w:r>
-      <w:r>
-        <w:rPr>
-          <w:rStyle w:val="VerbatimChar"/>
-        </w:rPr>
-        <w:t xml:space="preserve">rtl_generator.py</w:t>
-      </w:r>
-      <w:r>
-        <w:t xml:space="preserve">,</w:t>
-      </w:r>
-      <w:r>
-        <w:t xml:space="preserve"> </w:t>
-      </w:r>
-      <w:r>
-        <w:rPr>
-          <w:rStyle w:val="VerbatimChar"/>
-        </w:rPr>
-        <w:t xml:space="preserve">simulator.py</w:t>
-      </w:r>
-      <w:r>
-        <w:t xml:space="preserve">, and</w:t>
-      </w:r>
-      <w:r>
-        <w:t xml:space="preserve"> </w:t>
-      </w:r>
-      <w:r>
-        <w:rPr>
-          <w:rStyle w:val="VerbatimChar"/>
-        </w:rPr>
-        <w:t xml:space="preserve">baseline.py</w:t>
-      </w:r>
-      <w:r>
-        <w:t xml:space="preserve"> </w:t>
-      </w:r>
-      <w:r>
-        <w:t xml:space="preserve">implement</w:t>
-      </w:r>
-      <w:r>
-        <w:t xml:space="preserve"> </w:t>
-      </w:r>
-      <w:r>
-        <w:t xml:space="preserve">the pipeline.</w:t>
-      </w:r>
-      <w:r>
-        <w:t xml:space="preserve"> </w:t>
-      </w:r>
-      <w:r>
-        <w:rPr>
-          <w:rStyle w:val="VerbatimChar"/>
-        </w:rPr>
-        <w:t xml:space="preserve">./scripts/run_examples.sh</w:t>
-      </w:r>
-      <w:r>
-        <w:t xml:space="preserve"> </w:t>
-      </w:r>
-      <w:r>
-        <w:t xml:space="preserve">runs both tasks with two calls total.</w:t>
-      </w:r>
-      <w:r>
-        <w:t xml:space="preserve"> </w:t>
-      </w:r>
-      <w:r>
-        <w:t xml:space="preserve">This control baseline performs no feedback-driven repair or automatic retry.</w:t>
-      </w:r>
-    </w:p>
-    <w:bookmarkEnd w:id="23"/>
-    <w:bookmarkStart w:id="27" w:name="section-4.-test-case-and-baseline-output"/>
-    <w:p>
-      <w:pPr>
-        <w:pStyle w:val="Heading2"/>
-      </w:pPr>
-      <w:r>
-        <w:t xml:space="preserve">Section 4. Test Case and Baseline Output</w:t>
-      </w:r>
-    </w:p>
-    <w:p>
-      <w:pPr>
-        <w:pStyle w:val="FirstParagraph"/>
-      </w:pPr>
-      <w:r>
-        <w:t xml:space="preserve">The counter checks synchronous reset, enable/hold, and 8-bit wrap. The more complex</w:t>
-      </w:r>
-      <w:r>
-        <w:t xml:space="preserve"> </w:t>
-      </w:r>
-      <w:r>
-        <w:t xml:space="preserve">FIFO stores sixteen 8-bit words, with registered reads, occupancy/full/empty,</w:t>
-      </w:r>
-      <w:r>
-        <w:t xml:space="preserve"> </w:t>
-      </w:r>
-      <w:r>
-        <w:t xml:space="preserve">ordering, and pointer wrap. At full, simultaneous read/write accepts both; at</w:t>
-      </w:r>
-      <w:r>
-        <w:t xml:space="preserve"> </w:t>
-      </w:r>
-      <w:r>
-        <w:t xml:space="preserve">empty it accepts only the write, with no bypass. An independent shift-queue</w:t>
-      </w:r>
-      <w:r>
-        <w:t xml:space="preserve"> </w:t>
-      </w:r>
-      <w:r>
-        <w:t xml:space="preserve">scoreboard checks directed boundaries and 512 deterministic stimulus cycles.</w:t>
-      </w:r>
-    </w:p>
-    <w:p>
-      <w:pPr>
-        <w:pStyle w:val="BodyText"/>
-      </w:pPr>
-      <w:r>
-        <w:t xml:space="preserve">Both designs compiled, simulated, and emitted</w:t>
+        <w:t xml:space="preserve">src/{llm_client,rtl_generator,simulator,baseline}.py</w:t>
+      </w:r>
+      <w:r>
+        <w:t xml:space="preserve">.</w:t>
+      </w:r>
+      <w:r>
+        <w:t xml:space="preserve"> </w:t>
+      </w:r>
+      <w:r>
+        <w:t xml:space="preserve">This one-shot control has</w:t>
       </w:r>
       <w:r>
         <w:t xml:space="preserve"> </w:t>
@@ -431,31 +442,123 @@
           <w:b/>
           <w:bCs/>
         </w:rPr>
+        <w:t xml:space="preserve">no repair or automatic retry</w:t>
+      </w:r>
+      <w:r>
+        <w:t xml:space="preserve">.</w:t>
+      </w:r>
+    </w:p>
+    <w:bookmarkEnd w:id="23"/>
+    <w:bookmarkStart w:id="24" w:name="section-4.-test-case-and-baseline-output"/>
+    <w:p>
+      <w:pPr>
+        <w:pStyle w:val="Heading2"/>
+      </w:pPr>
+      <w:r>
+        <w:t xml:space="preserve">Section 4. Test Case and Baseline Output</w:t>
+      </w:r>
+    </w:p>
+    <w:p>
+      <w:pPr>
+        <w:pStyle w:val="Compact"/>
+        <w:numPr>
+          <w:ilvl w:val="0"/>
+          <w:numId w:val="1004"/>
+        </w:numPr>
+      </w:pPr>
+      <w:r>
+        <w:rPr>
+          <w:b/>
+          <w:bCs/>
+        </w:rPr>
+        <w:t xml:space="preserve">8-bit counter:</w:t>
+      </w:r>
+      <w:r>
+        <w:t xml:space="preserve"> </w:t>
+      </w:r>
+      <w:r>
+        <w:t xml:space="preserve">Synchronous reset, enable/hold, and wraparound;</w:t>
+      </w:r>
+      <w:r>
+        <w:t xml:space="preserve"> </w:t>
+      </w:r>
+      <w:r>
+        <w:rPr>
+          <w:b/>
+          <w:bCs/>
+        </w:rPr>
+        <w:t xml:space="preserve">853 checks passed</w:t>
+      </w:r>
+      <w:r>
+        <w:t xml:space="preserve">.</w:t>
+      </w:r>
+    </w:p>
+    <w:p>
+      <w:pPr>
+        <w:pStyle w:val="Compact"/>
+        <w:numPr>
+          <w:ilvl w:val="0"/>
+          <w:numId w:val="1004"/>
+        </w:numPr>
+      </w:pPr>
+      <w:r>
+        <w:rPr>
+          <w:b/>
+          <w:bCs/>
+        </w:rPr>
+        <w:t xml:space="preserve">16×8 FIFO:</w:t>
+      </w:r>
+      <w:r>
+        <w:t xml:space="preserve"> </w:t>
+      </w:r>
+      <w:r>
+        <w:t xml:space="preserve">Registered reads, ordering, occupancy flags, and pointer wrap. Simultaneous read/write accepts both at full and only the write at empty (no bypass). Independent queue scoreboard:</w:t>
+      </w:r>
+      <w:r>
+        <w:t xml:space="preserve"> </w:t>
+      </w:r>
+      <w:r>
+        <w:rPr>
+          <w:b/>
+          <w:bCs/>
+        </w:rPr>
+        <w:t xml:space="preserve">2,233 checks / 744 cycles passed</w:t>
+      </w:r>
+      <w:r>
+        <w:t xml:space="preserve">.</w:t>
+      </w:r>
+    </w:p>
+    <w:p>
+      <w:pPr>
+        <w:pStyle w:val="FirstParagraph"/>
+      </w:pPr>
+      <w:r>
+        <w:t xml:space="preserve">On September 6, 2026, both designs compiled, simulated, and returned</w:t>
+      </w:r>
+      <w:r>
+        <w:t xml:space="preserve"> </w:t>
+      </w:r>
+      <w:r>
+        <w:rPr>
+          <w:b/>
+          <w:bCs/>
+        </w:rPr>
         <w:t xml:space="preserve">TEST_PASS</w:t>
       </w:r>
       <w:r>
-        <w:t xml:space="preserve"> </w:t>
-      </w:r>
-      <w:r>
-        <w:t xml:space="preserve">on September 6, 2026,</w:t>
-      </w:r>
-      <w:r>
-        <w:t xml:space="preserve"> </w:t>
-      </w:r>
-      <w:r>
-        <w:t xml:space="preserve">including fresh-clone reruns. First counter: 853 checks, 1.985 s generation,</w:t>
-      </w:r>
-      <w:r>
-        <w:t xml:space="preserve"> </w:t>
-      </w:r>
-      <w:r>
-        <w:t xml:space="preserve">329 tokens. First FIFO: 744 cycles, 2,233 checks, 3.478 s, 1,099 tokens.</w:t>
-      </w:r>
-      <w:r>
-        <w:t xml:space="preserve"> </w:t>
-      </w:r>
-      <w:r>
-        <w:t xml:space="preserve">FIFO compilation emitted a nonfatal ignored-</w:t>
+        <w:t xml:space="preserve">,</w:t>
+      </w:r>
+      <w:r>
+        <w:t xml:space="preserve"> </w:t>
+      </w:r>
+      <w:r>
+        <w:t xml:space="preserve">including fresh-clone reruns. First-run generation: counter 1.985 s / 329 tokens;</w:t>
+      </w:r>
+      <w:r>
+        <w:t xml:space="preserve"> </w:t>
+      </w:r>
+      <w:r>
+        <w:t xml:space="preserve">FIFO 3.478 s / 1,099 tokens. The FIFO had a nonfatal ignored-</w:t>
       </w:r>
       <w:r>
         <w:rPr>
@@ -473,9 +576,270 @@
         <w:t xml:space="preserve"> </w:t>
       </w:r>
       <w:r>
+        <w:t xml:space="preserve">The genuine terminal screenshot below records the initial suite.</w:t>
+      </w:r>
+    </w:p>
+    <w:bookmarkEnd w:id="24"/>
+    <w:bookmarkStart w:id="25" w:name="X5f2a089c1ec1ceb33bd13bd54a987c562746303"/>
+    <w:p>
+      <w:pPr>
+        <w:pStyle w:val="Heading2"/>
+        <w:pageBreakBefore/>
+      </w:pPr>
+      <w:r>
+        <w:t xml:space="preserve">Section 5. Reproducibility and Run Instructions</w:t>
+      </w:r>
+    </w:p>
+    <w:p>
+      <w:pPr>
+        <w:pStyle w:val="Compact"/>
+        <w:numPr>
+          <w:ilvl w:val="0"/>
+          <w:numId w:val="1005"/>
+        </w:numPr>
+      </w:pPr>
+      <w:r>
+        <w:t xml:space="preserve">Clone the linked repository and enter</w:t>
+      </w:r>
+      <w:r>
+        <w:t xml:space="preserve"> </w:t>
+      </w:r>
+      <w:r>
         <w:rPr>
           <w:rStyle w:val="VerbatimChar"/>
         </w:rPr>
+        <w:t xml:space="preserve">rtlrepair-agent</w:t>
+      </w:r>
+      <w:r>
+        <w:t xml:space="preserve">. Install Python 3.10+ and Icarus Verilog (macOS:</w:t>
+      </w:r>
+      <w:r>
+        <w:t xml:space="preserve"> </w:t>
+      </w:r>
+      <w:r>
+        <w:rPr>
+          <w:rStyle w:val="VerbatimChar"/>
+        </w:rPr>
+        <w:t xml:space="preserve">brew install icarus-verilog</w:t>
+      </w:r>
+      <w:r>
+        <w:t xml:space="preserve">).</w:t>
+      </w:r>
+    </w:p>
+    <w:p>
+      <w:pPr>
+        <w:pStyle w:val="Compact"/>
+        <w:numPr>
+          <w:ilvl w:val="0"/>
+          <w:numId w:val="1005"/>
+        </w:numPr>
+      </w:pPr>
+      <w:r>
+        <w:t xml:space="preserve">Run</w:t>
+      </w:r>
+      <w:r>
+        <w:t xml:space="preserve"> </w:t>
+      </w:r>
+      <w:r>
+        <w:rPr>
+          <w:rStyle w:val="VerbatimChar"/>
+        </w:rPr>
+        <w:t xml:space="preserve">python3 -m venv .venv</w:t>
+      </w:r>
+      <w:r>
+        <w:t xml:space="preserve">, then</w:t>
+      </w:r>
+      <w:r>
+        <w:t xml:space="preserve"> </w:t>
+      </w:r>
+      <w:r>
+        <w:rPr>
+          <w:rStyle w:val="VerbatimChar"/>
+        </w:rPr>
+        <w:t xml:space="preserve">source .venv/bin/activate</w:t>
+      </w:r>
+      <w:r>
+        <w:t xml:space="preserve"> </w:t>
+      </w:r>
+      <w:r>
+        <w:t xml:space="preserve">and</w:t>
+      </w:r>
+      <w:r>
+        <w:t xml:space="preserve"> </w:t>
+      </w:r>
+      <w:r>
+        <w:rPr>
+          <w:rStyle w:val="VerbatimChar"/>
+        </w:rPr>
+        <w:t xml:space="preserve">python -m pip install -r requirements.txt</w:t>
+      </w:r>
+      <w:r>
+        <w:t xml:space="preserve"> </w:t>
+      </w:r>
+      <w:r>
+        <w:t xml:space="preserve">(no third-party Python packages).</w:t>
+      </w:r>
+    </w:p>
+    <w:p>
+      <w:pPr>
+        <w:pStyle w:val="Compact"/>
+        <w:numPr>
+          <w:ilvl w:val="0"/>
+          <w:numId w:val="1005"/>
+        </w:numPr>
+      </w:pPr>
+      <w:r>
+        <w:t xml:space="preserve">Copy</w:t>
+      </w:r>
+      <w:r>
+        <w:t xml:space="preserve"> </w:t>
+      </w:r>
+      <w:r>
+        <w:rPr>
+          <w:rStyle w:val="VerbatimChar"/>
+        </w:rPr>
+        <w:t xml:space="preserve">.env.example</w:t>
+      </w:r>
+      <w:r>
+        <w:t xml:space="preserve"> </w:t>
+      </w:r>
+      <w:r>
+        <w:t xml:space="preserve">to</w:t>
+      </w:r>
+      <w:r>
+        <w:t xml:space="preserve"> </w:t>
+      </w:r>
+      <w:r>
+        <w:rPr>
+          <w:rStyle w:val="VerbatimChar"/>
+        </w:rPr>
+        <w:t xml:space="preserve">.env</w:t>
+      </w:r>
+      <w:r>
+        <w:t xml:space="preserve">; set</w:t>
+      </w:r>
+      <w:r>
+        <w:t xml:space="preserve"> </w:t>
+      </w:r>
+      <w:r>
+        <w:rPr>
+          <w:rStyle w:val="VerbatimChar"/>
+        </w:rPr>
+        <w:t xml:space="preserve">OPENAI_API_KEY</w:t>
+      </w:r>
+      <w:r>
+        <w:t xml:space="preserve"> </w:t>
+      </w:r>
+      <w:r>
+        <w:t xml:space="preserve">and keep</w:t>
+      </w:r>
+      <w:r>
+        <w:t xml:space="preserve"> </w:t>
+      </w:r>
+      <w:r>
+        <w:rPr>
+          <w:rStyle w:val="VerbatimChar"/>
+        </w:rPr>
+        <w:t xml:space="preserve">OPENAI_MODEL=gpt-4.1-2025-04-14</w:t>
+      </w:r>
+      <w:r>
+        <w:t xml:space="preserve">. Model access is required.</w:t>
+      </w:r>
+    </w:p>
+    <w:p>
+      <w:pPr>
+        <w:pStyle w:val="Compact"/>
+        <w:numPr>
+          <w:ilvl w:val="0"/>
+          <w:numId w:val="1005"/>
+        </w:numPr>
+      </w:pPr>
+      <w:r>
+        <w:t xml:space="preserve">Run</w:t>
+      </w:r>
+      <w:r>
+        <w:t xml:space="preserve"> </w:t>
+      </w:r>
+      <w:r>
+        <w:rPr>
+          <w:rStyle w:val="VerbatimChar"/>
+          <w:b/>
+          <w:bCs/>
+        </w:rPr>
+        <w:t xml:space="preserve">./scripts/run_examples.sh</w:t>
+      </w:r>
+      <w:r>
+        <w:t xml:space="preserve"> </w:t>
+      </w:r>
+      <w:r>
+        <w:t xml:space="preserve">(one call per design; two total).</w:t>
+      </w:r>
+    </w:p>
+    <w:p>
+      <w:pPr>
+        <w:pStyle w:val="Compact"/>
+        <w:numPr>
+          <w:ilvl w:val="0"/>
+          <w:numId w:val="1006"/>
+        </w:numPr>
+      </w:pPr>
+      <w:r>
+        <w:rPr>
+          <w:b/>
+          <w:bCs/>
+        </w:rPr>
+        <w:t xml:space="preserve">Inputs:</w:t>
+      </w:r>
+      <w:r>
+        <w:t xml:space="preserve"> </w:t>
+      </w:r>
+      <w:r>
+        <w:rPr>
+          <w:rStyle w:val="VerbatimChar"/>
+        </w:rPr>
+        <w:t xml:space="preserve">examples/{counter,fifo}/spec.txt</w:t>
+      </w:r>
+      <w:r>
+        <w:t xml:space="preserve"> </w:t>
+      </w:r>
+      <w:r>
+        <w:t xml:space="preserve">and</w:t>
+      </w:r>
+      <w:r>
+        <w:t xml:space="preserve"> </w:t>
+      </w:r>
+      <w:r>
+        <w:rPr>
+          <w:rStyle w:val="VerbatimChar"/>
+        </w:rPr>
+        <w:t xml:space="preserve">tb.sv</w:t>
+      </w:r>
+      <w:r>
+        <w:t xml:space="preserve">.</w:t>
+      </w:r>
+    </w:p>
+    <w:p>
+      <w:pPr>
+        <w:pStyle w:val="Compact"/>
+        <w:numPr>
+          <w:ilvl w:val="0"/>
+          <w:numId w:val="1006"/>
+        </w:numPr>
+      </w:pPr>
+      <w:r>
+        <w:rPr>
+          <w:b/>
+          <w:bCs/>
+        </w:rPr>
+        <w:t xml:space="preserve">Outputs:</w:t>
+      </w:r>
+      <w:r>
+        <w:t xml:space="preserve"> </w:t>
+      </w:r>
+      <w:r>
+        <w:rPr>
+          <w:rStyle w:val="VerbatimChar"/>
+        </w:rPr>
         <w:t xml:space="preserve">generated/{counter,fifo}.sv</w:t>
       </w:r>
       <w:r>
@@ -503,16 +867,172 @@
         <w:t xml:space="preserve">artifacts/{baseline,fifo}_output.txt</w:t>
       </w:r>
       <w:r>
-        <w:t xml:space="preserve"> </w:t>
-      </w:r>
-      <w:r>
-        <w:t xml:space="preserve">preserve the actual outputs.</w:t>
-      </w:r>
-      <w:r>
-        <w:t xml:space="preserve"> </w:t>
-      </w:r>
-      <w:r>
-        <w:t xml:space="preserve">Earlier GPT-5.6 evidence is archived.</w:t>
+        <w:t xml:space="preserve">.</w:t>
+      </w:r>
+    </w:p>
+    <w:p>
+      <w:pPr>
+        <w:pStyle w:val="Compact"/>
+        <w:numPr>
+          <w:ilvl w:val="0"/>
+          <w:numId w:val="1006"/>
+        </w:numPr>
+      </w:pPr>
+      <w:r>
+        <w:rPr>
+          <w:b/>
+          <w:bCs/>
+        </w:rPr>
+        <w:t xml:space="preserve">Setup details:</w:t>
+      </w:r>
+      <w:r>
+        <w:t xml:space="preserve"> </w:t>
+      </w:r>
+      <w:r>
+        <w:t xml:space="preserve">README includes Linux instructions and offline tests;</w:t>
+      </w:r>
+      <w:r>
+        <w:t xml:space="preserve"> </w:t>
+      </w:r>
+      <w:r>
+        <w:rPr>
+          <w:b/>
+          <w:bCs/>
+        </w:rPr>
+        <w:t xml:space="preserve">20 tests pass</w:t>
+      </w:r>
+      <w:r>
+        <w:t xml:space="preserve">.</w:t>
+      </w:r>
+    </w:p>
+    <w:bookmarkEnd w:id="25"/>
+    <w:bookmarkStart w:id="26" w:name="section-6.-initial-evaluation-plan"/>
+    <w:p>
+      <w:pPr>
+        <w:pStyle w:val="Heading2"/>
+      </w:pPr>
+      <w:r>
+        <w:t xml:space="preserve">Section 6. Initial Evaluation Plan</w:t>
+      </w:r>
+    </w:p>
+    <w:p>
+      <w:pPr>
+        <w:pStyle w:val="Compact"/>
+        <w:numPr>
+          <w:ilvl w:val="0"/>
+          <w:numId w:val="1007"/>
+        </w:numPr>
+      </w:pPr>
+      <w:r>
+        <w:rPr>
+          <w:b/>
+          <w:bCs/>
+        </w:rPr>
+        <w:t xml:space="preserve">Comparison:</w:t>
+      </w:r>
+      <w:r>
+        <w:t xml:space="preserve"> </w:t>
+      </w:r>
+      <w:r>
+        <w:t xml:space="preserve">One-shot vs. bounded repair, with the same model, initial prompt, tasks, and testbenches over repeated trials. Include budget-matched resampling; retain failures.</w:t>
+      </w:r>
+    </w:p>
+    <w:p>
+      <w:pPr>
+        <w:pStyle w:val="Compact"/>
+        <w:numPr>
+          <w:ilvl w:val="0"/>
+          <w:numId w:val="1007"/>
+        </w:numPr>
+      </w:pPr>
+      <w:r>
+        <w:rPr>
+          <w:b/>
+          <w:bCs/>
+        </w:rPr>
+        <w:t xml:space="preserve">Metrics:</w:t>
+      </w:r>
+      <w:r>
+        <w:t xml:space="preserve"> </w:t>
+      </w:r>
+      <w:r>
+        <w:t xml:space="preserve">Functional pass rate (primary); compile rate, iterations, calls, tokens, latency, and measurable cost (secondary).</w:t>
+      </w:r>
+    </w:p>
+    <w:p>
+      <w:pPr>
+        <w:pStyle w:val="Compact"/>
+        <w:numPr>
+          <w:ilvl w:val="0"/>
+          <w:numId w:val="1007"/>
+        </w:numPr>
+      </w:pPr>
+      <w:r>
+        <w:rPr>
+          <w:b/>
+          <w:bCs/>
+        </w:rPr>
+        <w:t xml:space="preserve">Expansion:</w:t>
+      </w:r>
+      <w:r>
+        <w:t xml:space="preserve"> </w:t>
+      </w:r>
+      <w:r>
+        <w:t xml:space="preserve">More curated tasks, then consider VerilogEval or RTLLM.</w:t>
+      </w:r>
+    </w:p>
+    <w:bookmarkEnd w:id="26"/>
+    <w:bookmarkStart w:id="30" w:name="section-7.-limitations-and-next-steps"/>
+    <w:p>
+      <w:pPr>
+        <w:pStyle w:val="Heading2"/>
+      </w:pPr>
+      <w:r>
+        <w:t xml:space="preserve">Section 7. Limitations and Next Steps</w:t>
+      </w:r>
+    </w:p>
+    <w:p>
+      <w:pPr>
+        <w:pStyle w:val="Compact"/>
+        <w:numPr>
+          <w:ilvl w:val="0"/>
+          <w:numId w:val="1008"/>
+        </w:numPr>
+      </w:pPr>
+      <w:r>
+        <w:rPr>
+          <w:b/>
+          <w:bCs/>
+        </w:rPr>
+        <w:t xml:space="preserve">Limits:</w:t>
+      </w:r>
+      <w:r>
+        <w:t xml:space="preserve"> </w:t>
+      </w:r>
+      <w:r>
+        <w:t xml:space="preserve">Two tasks do not establish generality or model ranking. Simulation checks only tested behavior, not synthesizability. Results depend on test coverage, model variability, and API availability.</w:t>
+      </w:r>
+    </w:p>
+    <w:p>
+      <w:pPr>
+        <w:pStyle w:val="Compact"/>
+        <w:numPr>
+          <w:ilvl w:val="0"/>
+          <w:numId w:val="1008"/>
+        </w:numPr>
+      </w:pPr>
+      <w:r>
+        <w:rPr>
+          <w:b/>
+          <w:bCs/>
+        </w:rPr>
+        <w:t xml:space="preserve">Next:</w:t>
+      </w:r>
+      <w:r>
+        <w:t xml:space="preserve"> </w:t>
+      </w:r>
+      <w:r>
+        <w:t xml:space="preserve">Implement diagnosis and bounded repair, then expand evaluation.</w:t>
       </w:r>
     </w:p>
     <w:p>
@@ -522,20 +1042,20 @@
       <w:r>
         <w:drawing>
           <wp:inline>
-            <wp:extent cx="5669280" cy="3656713"/>
+            <wp:extent cx="4754880" cy="3066920"/>
             <wp:effectExtent b="0" l="0" r="0" t="0"/>
-            <wp:docPr descr="Genuine Terminal capture: GPT-4.1 FIFO command, verification output, and both task results." title="" id="25" name="Picture"/>
+            <wp:docPr descr="Actual GPT-4.1 run: FIFO verification and counter/FIFO PASS summary." title="" id="28" name="Picture"/>
             <a:graphic>
               <a:graphicData uri="http://schemas.openxmlformats.org/drawingml/2006/picture">
                 <pic:pic>
                   <pic:nvPicPr>
-                    <pic:cNvPr descr="../artifacts/baseline_screenshot.png" id="26" name="Picture"/>
+                    <pic:cNvPr descr="../artifacts/baseline_screenshot.png" id="29" name="Picture"/>
                     <pic:cNvPicPr>
                       <a:picLocks noChangeArrowheads="1" noChangeAspect="1"/>
                     </pic:cNvPicPr>
                   </pic:nvPicPr>
                   <pic:blipFill>
-                    <a:blip r:embed="rId24"/>
+                    <a:blip r:embed="rId27"/>
                     <a:stretch>
                       <a:fillRect/>
                     </a:stretch>
@@ -543,7 +1063,7 @@
                   <pic:spPr bwMode="auto">
                     <a:xfrm>
                       <a:off x="0" y="0"/>
-                      <a:ext cx="5669280" cy="3656713"/>
+                      <a:ext cx="4754880" cy="3066920"/>
                     </a:xfrm>
                     <a:prstGeom prst="rect">
                       <a:avLst/>
@@ -567,331 +1087,7 @@
         <w:pStyle w:val="ImageCaption"/>
       </w:pPr>
       <w:r>
-        <w:t xml:space="preserve">Genuine Terminal capture: GPT-4.1 FIFO command, verification output, and both task results.</w:t>
-      </w:r>
-    </w:p>
-    <w:bookmarkEnd w:id="27"/>
-    <w:bookmarkStart w:id="28" w:name="X5f2a089c1ec1ceb33bd13bd54a987c562746303"/>
-    <w:p>
-      <w:pPr>
-        <w:pStyle w:val="Heading2"/>
-      </w:pPr>
-      <w:r>
-        <w:t xml:space="preserve">Section 5. Reproducibility and Run Instructions</w:t>
-      </w:r>
-    </w:p>
-    <w:p>
-      <w:pPr>
-        <w:pStyle w:val="FirstParagraph"/>
-      </w:pPr>
-      <w:r>
-        <w:t xml:space="preserve">Clone the repository above and enter</w:t>
-      </w:r>
-      <w:r>
-        <w:t xml:space="preserve"> </w:t>
-      </w:r>
-      <w:r>
-        <w:rPr>
-          <w:rStyle w:val="VerbatimChar"/>
-        </w:rPr>
-        <w:t xml:space="preserve">rtlrepair-agent</w:t>
-      </w:r>
-      <w:r>
-        <w:t xml:space="preserve">. Install Python 3.10+</w:t>
-      </w:r>
-      <w:r>
-        <w:t xml:space="preserve"> </w:t>
-      </w:r>
-      <w:r>
-        <w:t xml:space="preserve">and Icarus Verilog (</w:t>
-      </w:r>
-      <w:r>
-        <w:rPr>
-          <w:rStyle w:val="VerbatimChar"/>
-        </w:rPr>
-        <w:t xml:space="preserve">brew install icarus-verilog</w:t>
-      </w:r>
-      <w:r>
-        <w:t xml:space="preserve"> </w:t>
-      </w:r>
-      <w:r>
-        <w:t xml:space="preserve">on macOS). Run</w:t>
-      </w:r>
-      <w:r>
-        <w:t xml:space="preserve"> </w:t>
-      </w:r>
-      <w:r>
-        <w:rPr>
-          <w:rStyle w:val="VerbatimChar"/>
-        </w:rPr>
-        <w:t xml:space="preserve">python3 -m venv .venv</w:t>
-      </w:r>
-      <w:r>
-        <w:t xml:space="preserve">,</w:t>
-      </w:r>
-      <w:r>
-        <w:t xml:space="preserve"> </w:t>
-      </w:r>
-      <w:r>
-        <w:rPr>
-          <w:rStyle w:val="VerbatimChar"/>
-        </w:rPr>
-        <w:t xml:space="preserve">source .venv/bin/activate</w:t>
-      </w:r>
-      <w:r>
-        <w:t xml:space="preserve">, and</w:t>
-      </w:r>
-      <w:r>
-        <w:t xml:space="preserve"> </w:t>
-      </w:r>
-      <w:r>
-        <w:rPr>
-          <w:rStyle w:val="VerbatimChar"/>
-        </w:rPr>
-        <w:t xml:space="preserve">python -m pip install -r requirements.txt</w:t>
-      </w:r>
-      <w:r>
-        <w:t xml:space="preserve"> </w:t>
-      </w:r>
-      <w:r>
-        <w:t xml:space="preserve">(standard library only).</w:t>
-      </w:r>
-      <w:r>
-        <w:t xml:space="preserve"> </w:t>
-      </w:r>
-      <w:r>
-        <w:t xml:space="preserve">Copy</w:t>
-      </w:r>
-      <w:r>
-        <w:t xml:space="preserve"> </w:t>
-      </w:r>
-      <w:r>
-        <w:rPr>
-          <w:rStyle w:val="VerbatimChar"/>
-        </w:rPr>
-        <w:t xml:space="preserve">.env.example</w:t>
-      </w:r>
-      <w:r>
-        <w:t xml:space="preserve"> </w:t>
-      </w:r>
-      <w:r>
-        <w:t xml:space="preserve">to</w:t>
-      </w:r>
-      <w:r>
-        <w:t xml:space="preserve"> </w:t>
-      </w:r>
-      <w:r>
-        <w:rPr>
-          <w:rStyle w:val="VerbatimChar"/>
-        </w:rPr>
-        <w:t xml:space="preserve">.env</w:t>
-      </w:r>
-      <w:r>
-        <w:t xml:space="preserve">; fill</w:t>
-      </w:r>
-      <w:r>
-        <w:t xml:space="preserve"> </w:t>
-      </w:r>
-      <w:r>
-        <w:rPr>
-          <w:rStyle w:val="VerbatimChar"/>
-        </w:rPr>
-        <w:t xml:space="preserve">OPENAI_API_KEY</w:t>
-      </w:r>
-      <w:r>
-        <w:t xml:space="preserve"> </w:t>
-      </w:r>
-      <w:r>
-        <w:t xml:space="preserve">and retain</w:t>
-      </w:r>
-      <w:r>
-        <w:t xml:space="preserve"> </w:t>
-      </w:r>
-      <w:r>
-        <w:rPr>
-          <w:rStyle w:val="VerbatimChar"/>
-        </w:rPr>
-        <w:t xml:space="preserve">OPENAI_MODEL=gpt-4.1-2025-04-14</w:t>
-      </w:r>
-      <w:r>
-        <w:t xml:space="preserve">. Optional</w:t>
-      </w:r>
-      <w:r>
-        <w:t xml:space="preserve"> </w:t>
-      </w:r>
-      <w:r>
-        <w:rPr>
-          <w:rStyle w:val="VerbatimChar"/>
-        </w:rPr>
-        <w:t xml:space="preserve">OPENAI_BASE_URL</w:t>
-      </w:r>
-      <w:r>
-        <w:t xml:space="preserve"> </w:t>
-      </w:r>
-      <w:r>
-        <w:t xml:space="preserve">defaults to</w:t>
-      </w:r>
-      <w:r>
-        <w:t xml:space="preserve"> </w:t>
-      </w:r>
-      <w:r>
-        <w:rPr>
-          <w:rStyle w:val="VerbatimChar"/>
-        </w:rPr>
-        <w:t xml:space="preserve">https://api.openai.com/v1</w:t>
-      </w:r>
-      <w:r>
-        <w:t xml:space="preserve">. Run</w:t>
-      </w:r>
-      <w:r>
-        <w:t xml:space="preserve"> </w:t>
-      </w:r>
-      <w:r>
-        <w:rPr>
-          <w:rStyle w:val="VerbatimChar"/>
-        </w:rPr>
-        <w:t xml:space="preserve">./scripts/run_examples.sh</w:t>
-      </w:r>
-      <w:r>
-        <w:t xml:space="preserve">. Each</w:t>
-      </w:r>
-      <w:r>
-        <w:t xml:space="preserve"> </w:t>
-      </w:r>
-      <w:r>
-        <w:rPr>
-          <w:rStyle w:val="VerbatimChar"/>
-        </w:rPr>
-        <w:t xml:space="preserve">examples/&lt;task&gt;/</w:t>
-      </w:r>
-      <w:r>
-        <w:t xml:space="preserve"> </w:t>
-      </w:r>
-      <w:r>
-        <w:t xml:space="preserve">contains</w:t>
-      </w:r>
-      <w:r>
-        <w:t xml:space="preserve"> </w:t>
-      </w:r>
-      <w:r>
-        <w:rPr>
-          <w:rStyle w:val="VerbatimChar"/>
-        </w:rPr>
-        <w:t xml:space="preserve">spec.txt</w:t>
-      </w:r>
-      <w:r>
-        <w:t xml:space="preserve"> </w:t>
-      </w:r>
-      <w:r>
-        <w:t xml:space="preserve">and</w:t>
-      </w:r>
-      <w:r>
-        <w:t xml:space="preserve"> </w:t>
-      </w:r>
-      <w:r>
-        <w:rPr>
-          <w:rStyle w:val="VerbatimChar"/>
-        </w:rPr>
-        <w:t xml:space="preserve">tb.sv</w:t>
-      </w:r>
-      <w:r>
-        <w:t xml:space="preserve">; outputs are listed above. API model access is</w:t>
-      </w:r>
-      <w:r>
-        <w:t xml:space="preserve"> </w:t>
-      </w:r>
-      <w:r>
-        <w:t xml:space="preserve">required. README supplies Linux setup and offline verification; 20 tests pass.</w:t>
-      </w:r>
-    </w:p>
-    <w:bookmarkEnd w:id="28"/>
-    <w:bookmarkStart w:id="29" w:name="section-6.-initial-evaluation-plan"/>
-    <w:p>
-      <w:pPr>
-        <w:pStyle w:val="Heading2"/>
-      </w:pPr>
-      <w:r>
-        <w:t xml:space="preserve">Section 6. Initial Evaluation Plan</w:t>
-      </w:r>
-    </w:p>
-    <w:p>
-      <w:pPr>
-        <w:pStyle w:val="FirstParagraph"/>
-      </w:pPr>
-      <w:r>
-        <w:t xml:space="preserve">Compare one-shot generation with bounded verification-guided repair using the</w:t>
-      </w:r>
-      <w:r>
-        <w:t xml:space="preserve"> </w:t>
-      </w:r>
-      <w:r>
-        <w:t xml:space="preserve">same model, initial prompt, tasks, and independent testbenches over repeated</w:t>
-      </w:r>
-      <w:r>
-        <w:t xml:space="preserve"> </w:t>
-      </w:r>
-      <w:r>
-        <w:t xml:space="preserve">trials. Primary metric: functional pass rate. Also measure compile rate,</w:t>
-      </w:r>
-      <w:r>
-        <w:t xml:space="preserve"> </w:t>
-      </w:r>
-      <w:r>
-        <w:t xml:space="preserve">iterations, calls, tokens, latency, and measurable cost. Include budget-matched</w:t>
-      </w:r>
-      <w:r>
-        <w:t xml:space="preserve"> </w:t>
-      </w:r>
-      <w:r>
-        <w:t xml:space="preserve">independent resampling. Expand curated examples before considering VerilogEval</w:t>
-      </w:r>
-      <w:r>
-        <w:t xml:space="preserve"> </w:t>
-      </w:r>
-      <w:r>
-        <w:t xml:space="preserve">or RTLLM. Retain all failed runs.</w:t>
-      </w:r>
-    </w:p>
-    <w:bookmarkEnd w:id="29"/>
-    <w:bookmarkStart w:id="30" w:name="section-7.-limitations-and-next-steps"/>
-    <w:p>
-      <w:pPr>
-        <w:pStyle w:val="Heading2"/>
-      </w:pPr>
-      <w:r>
-        <w:t xml:space="preserve">Section 7. Limitations and Next Steps</w:t>
-      </w:r>
-    </w:p>
-    <w:p>
-      <w:pPr>
-        <w:pStyle w:val="FirstParagraph"/>
-      </w:pPr>
-      <w:r>
-        <w:t xml:space="preserve">Two tasks cannot establish generality or a model ranking; state comparisons are</w:t>
-      </w:r>
-      <w:r>
-        <w:t xml:space="preserve"> </w:t>
-      </w:r>
-      <w:r>
-        <w:t xml:space="preserve">not separate design tasks. Simulation covers only tested behavior and does not</w:t>
-      </w:r>
-      <w:r>
-        <w:t xml:space="preserve"> </w:t>
-      </w:r>
-      <w:r>
-        <w:t xml:space="preserve">prove synthesizability. Model nondeterminism, API availability, and testbench</w:t>
-      </w:r>
-      <w:r>
-        <w:t xml:space="preserve"> </w:t>
-      </w:r>
-      <w:r>
-        <w:t xml:space="preserve">coverage limit reliability. Next: implement diagnosis and bounded repair, expand</w:t>
-      </w:r>
-      <w:r>
-        <w:t xml:space="preserve"> </w:t>
-      </w:r>
-      <w:r>
-        <w:t xml:space="preserve">evaluation, and optionally incorporate synthesis/PPA feedback.</w:t>
+        <w:t xml:space="preserve">Actual GPT-4.1 run: FIFO verification and counter/FIFO PASS summary.</w:t>
       </w:r>
     </w:p>
     <w:bookmarkEnd w:id="30"/>
@@ -1266,6 +1462,194 @@
     <w:lvl w:ilvl="8">
       <w:numFmt w:val="bullet"/>
       <w:lvlText w:val=" "/>
+      <w:lvlJc w:val="left"/>
+      <w:pPr>
+        <w:ind w:left="6480" w:hanging="360"/>
+      </w:pPr>
+    </w:lvl>
+  </w:abstractNum>
+  <w:abstractNum w:abstractNumId="991">
+    <w:nsid w:val="0000A991"/>
+    <w:multiLevelType w:val="multilevel"/>
+    <w:lvl w:ilvl="0">
+      <w:numFmt w:val="bullet"/>
+      <w:lvlText w:val=""/>
+      <w:lvlJc w:val="left"/>
+      <w:pPr>
+        <w:ind w:left="720" w:hanging="360"/>
+      </w:pPr>
+      <w:rPr>
+        <w:rFonts w:ascii="Symbol" w:hAnsi="Symbol" w:cs="Symbol" w:hint="default"/>
+      </w:rPr>
+    </w:lvl>
+    <w:lvl w:ilvl="1">
+      <w:numFmt w:val="bullet"/>
+      <w:lvlText w:val="o"/>
+      <w:lvlJc w:val="left"/>
+      <w:pPr>
+        <w:ind w:left="1440" w:hanging="360"/>
+      </w:pPr>
+      <w:rPr>
+        <w:rFonts w:ascii="Courier New" w:hAnsi="Courier New" w:cs="Courier New" w:hint="default"/>
+      </w:rPr>
+    </w:lvl>
+    <w:lvl w:ilvl="2">
+      <w:numFmt w:val="bullet"/>
+      <w:lvlText w:val=""/>
+      <w:lvlJc w:val="left"/>
+      <w:pPr>
+        <w:ind w:left="2160" w:hanging="360"/>
+      </w:pPr>
+      <w:rPr>
+        <w:rFonts w:ascii="Wingdings" w:hAnsi="Wingdings" w:cs="Wingdings" w:hint="default"/>
+      </w:rPr>
+    </w:lvl>
+    <w:lvl w:ilvl="3">
+      <w:numFmt w:val="bullet"/>
+      <w:lvlText w:val=""/>
+      <w:lvlJc w:val="left"/>
+      <w:pPr>
+        <w:ind w:left="2880" w:hanging="360"/>
+      </w:pPr>
+      <w:rPr>
+        <w:rFonts w:ascii="Symbol" w:hAnsi="Symbol" w:cs="Symbol" w:hint="default"/>
+      </w:rPr>
+    </w:lvl>
+    <w:lvl w:ilvl="4">
+      <w:numFmt w:val="bullet"/>
+      <w:lvlText w:val="o"/>
+      <w:lvlJc w:val="left"/>
+      <w:pPr>
+        <w:ind w:left="3600" w:hanging="360"/>
+      </w:pPr>
+      <w:rPr>
+        <w:rFonts w:ascii="Courier New" w:hAnsi="Courier New" w:cs="Courier New" w:hint="default"/>
+      </w:rPr>
+    </w:lvl>
+    <w:lvl w:ilvl="5">
+      <w:numFmt w:val="bullet"/>
+      <w:lvlText w:val=""/>
+      <w:lvlJc w:val="left"/>
+      <w:pPr>
+        <w:ind w:left="4320" w:hanging="360"/>
+      </w:pPr>
+      <w:rPr>
+        <w:rFonts w:ascii="Wingdings" w:hAnsi="Wingdings" w:cs="Wingdings" w:hint="default"/>
+      </w:rPr>
+    </w:lvl>
+    <w:lvl w:ilvl="6">
+      <w:numFmt w:val="bullet"/>
+      <w:lvlText w:val=""/>
+      <w:lvlJc w:val="left"/>
+      <w:pPr>
+        <w:ind w:left="5040" w:hanging="360"/>
+      </w:pPr>
+      <w:rPr>
+        <w:rFonts w:ascii="Symbol" w:hAnsi="Symbol" w:cs="Symbol" w:hint="default"/>
+      </w:rPr>
+    </w:lvl>
+    <w:lvl w:ilvl="7">
+      <w:numFmt w:val="bullet"/>
+      <w:lvlText w:val="o"/>
+      <w:lvlJc w:val="left"/>
+      <w:pPr>
+        <w:ind w:left="5760" w:hanging="360"/>
+      </w:pPr>
+      <w:rPr>
+        <w:rFonts w:ascii="Courier New" w:hAnsi="Courier New" w:cs="Courier New" w:hint="default"/>
+      </w:rPr>
+    </w:lvl>
+    <w:lvl w:ilvl="8">
+      <w:numFmt w:val="bullet"/>
+      <w:lvlText w:val=""/>
+      <w:lvlJc w:val="left"/>
+      <w:pPr>
+        <w:ind w:left="6480" w:hanging="360"/>
+      </w:pPr>
+      <w:rPr>
+        <w:rFonts w:ascii="Wingdings" w:hAnsi="Wingdings" w:cs="Wingdings" w:hint="default"/>
+      </w:rPr>
+    </w:lvl>
+  </w:abstractNum>
+  <w:abstractNum w:abstractNumId="99411">
+    <w:nsid w:val="00A99411"/>
+    <w:multiLevelType w:val="multilevel"/>
+    <w:lvl w:ilvl="0">
+      <w:start w:val="1"/>
+      <w:numFmt w:val="decimal"/>
+      <w:lvlText w:val="%1."/>
+      <w:lvlJc w:val="left"/>
+      <w:pPr>
+        <w:ind w:left="720" w:hanging="360"/>
+      </w:pPr>
+    </w:lvl>
+    <w:lvl w:ilvl="1">
+      <w:start w:val="1"/>
+      <w:numFmt w:val="decimal"/>
+      <w:lvlText w:val="%2."/>
+      <w:lvlJc w:val="left"/>
+      <w:pPr>
+        <w:ind w:left="1440" w:hanging="360"/>
+      </w:pPr>
+    </w:lvl>
+    <w:lvl w:ilvl="2">
+      <w:start w:val="1"/>
+      <w:numFmt w:val="decimal"/>
+      <w:lvlText w:val="%3."/>
+      <w:lvlJc w:val="left"/>
+      <w:pPr>
+        <w:ind w:left="2160" w:hanging="360"/>
+      </w:pPr>
+    </w:lvl>
+    <w:lvl w:ilvl="3">
+      <w:start w:val="1"/>
+      <w:numFmt w:val="decimal"/>
+      <w:lvlText w:val="%4."/>
+      <w:lvlJc w:val="left"/>
+      <w:pPr>
+        <w:ind w:left="2880" w:hanging="360"/>
+      </w:pPr>
+    </w:lvl>
+    <w:lvl w:ilvl="4">
+      <w:start w:val="1"/>
+      <w:numFmt w:val="decimal"/>
+      <w:lvlText w:val="%5."/>
+      <w:lvlJc w:val="left"/>
+      <w:pPr>
+        <w:ind w:left="3600" w:hanging="360"/>
+      </w:pPr>
+    </w:lvl>
+    <w:lvl w:ilvl="5">
+      <w:start w:val="1"/>
+      <w:numFmt w:val="decimal"/>
+      <w:lvlText w:val="%6."/>
+      <w:lvlJc w:val="left"/>
+      <w:pPr>
+        <w:ind w:left="4320" w:hanging="360"/>
+      </w:pPr>
+    </w:lvl>
+    <w:lvl w:ilvl="6">
+      <w:start w:val="1"/>
+      <w:numFmt w:val="decimal"/>
+      <w:lvlText w:val="%7."/>
+      <w:lvlJc w:val="left"/>
+      <w:pPr>
+        <w:ind w:left="5040" w:hanging="360"/>
+      </w:pPr>
+    </w:lvl>
+    <w:lvl w:ilvl="7">
+      <w:start w:val="1"/>
+      <w:numFmt w:val="decimal"/>
+      <w:lvlText w:val="%8."/>
+      <w:lvlJc w:val="left"/>
+      <w:pPr>
+        <w:ind w:left="5760" w:hanging="360"/>
+      </w:pPr>
+    </w:lvl>
+    <w:lvl w:ilvl="8">
+      <w:start w:val="1"/>
+      <w:numFmt w:val="decimal"/>
+      <w:lvlText w:val="%9."/>
       <w:lvlJc w:val="left"/>
       <w:pPr>
         <w:ind w:left="6480" w:hanging="360"/>
@@ -1301,6 +1685,84 @@
   </w:num>
   <w:num w:numId="1000">
     <w:abstractNumId w:val="990"/>
+  </w:num>
+  <w:num w:numId="1001">
+    <w:abstractNumId w:val="991"/>
+  </w:num>
+  <w:num w:numId="1002">
+    <w:abstractNumId w:val="991"/>
+  </w:num>
+  <w:num w:numId="1003">
+    <w:abstractNumId w:val="99411"/>
+    <w:lvlOverride w:ilvl="0">
+      <w:startOverride w:val="1"/>
+    </w:lvlOverride>
+    <w:lvlOverride w:ilvl="1">
+      <w:startOverride w:val="1"/>
+    </w:lvlOverride>
+    <w:lvlOverride w:ilvl="2">
+      <w:startOverride w:val="1"/>
+    </w:lvlOverride>
+    <w:lvlOverride w:ilvl="3">
+      <w:startOverride w:val="1"/>
+    </w:lvlOverride>
+    <w:lvlOverride w:ilvl="4">
+      <w:startOverride w:val="1"/>
+    </w:lvlOverride>
+    <w:lvlOverride w:ilvl="5">
+      <w:startOverride w:val="1"/>
+    </w:lvlOverride>
+    <w:lvlOverride w:ilvl="6">
+      <w:startOverride w:val="1"/>
+    </w:lvlOverride>
+    <w:lvlOverride w:ilvl="7">
+      <w:startOverride w:val="1"/>
+    </w:lvlOverride>
+    <w:lvlOverride w:ilvl="8">
+      <w:startOverride w:val="1"/>
+    </w:lvlOverride>
+  </w:num>
+  <w:num w:numId="1004">
+    <w:abstractNumId w:val="991"/>
+  </w:num>
+  <w:num w:numId="1005">
+    <w:abstractNumId w:val="99411"/>
+    <w:lvlOverride w:ilvl="0">
+      <w:startOverride w:val="1"/>
+    </w:lvlOverride>
+    <w:lvlOverride w:ilvl="1">
+      <w:startOverride w:val="1"/>
+    </w:lvlOverride>
+    <w:lvlOverride w:ilvl="2">
+      <w:startOverride w:val="1"/>
+    </w:lvlOverride>
+    <w:lvlOverride w:ilvl="3">
+      <w:startOverride w:val="1"/>
+    </w:lvlOverride>
+    <w:lvlOverride w:ilvl="4">
+      <w:startOverride w:val="1"/>
+    </w:lvlOverride>
+    <w:lvlOverride w:ilvl="5">
+      <w:startOverride w:val="1"/>
+    </w:lvlOverride>
+    <w:lvlOverride w:ilvl="6">
+      <w:startOverride w:val="1"/>
+    </w:lvlOverride>
+    <w:lvlOverride w:ilvl="7">
+      <w:startOverride w:val="1"/>
+    </w:lvlOverride>
+    <w:lvlOverride w:ilvl="8">
+      <w:startOverride w:val="1"/>
+    </w:lvlOverride>
+  </w:num>
+  <w:num w:numId="1006">
+    <w:abstractNumId w:val="991"/>
+  </w:num>
+  <w:num w:numId="1007">
+    <w:abstractNumId w:val="991"/>
+  </w:num>
+  <w:num w:numId="1008">
+    <w:abstractNumId w:val="991"/>
   </w:num>
 </w:numbering>
 </file>

</xml_diff>

<commit_message>
Match proposal body font to Arial in Word and PDF
</commit_message>
<xml_diff>
--- a/proposal/capstone_proposal.docx
+++ b/proposal/capstone_proposal.docx
@@ -1772,7 +1772,7 @@
   <w:docDefaults>
     <w:rPrDefault>
       <w:rPr>
-        <w:rFonts w:asciiTheme="minorHAnsi" w:cstheme="minorBidi" w:eastAsiaTheme="minorEastAsia" w:hAnsiTheme="minorHAnsi"/>
+        <w:rFonts w:ascii="Arial" w:hAnsi="Arial" w:eastAsia="Arial" w:cs="Arial"/>
         <w:sz w:val="24"/>
         <w:szCs w:val="24"/>
         <w:lang w:bidi="ar-SA" w:eastAsia="en-US" w:val="en-US"/>
@@ -2032,6 +2032,7 @@
     <w:name w:val="Normal"/>
     <w:qFormat/>
     <w:rPr>
+      <w:rFonts w:ascii="Arial" w:hAnsi="Arial" w:eastAsia="Arial" w:cs="Arial"/>
       <w:sz w:val="22"/>
       <w:szCs w:val="22"/>
     </w:rPr>
@@ -2248,6 +2249,7 @@
       <w:spacing w:after="60" w:before="0" w:line="240" w:lineRule="auto"/>
     </w:pPr>
     <w:rPr>
+      <w:rFonts w:ascii="Arial" w:hAnsi="Arial" w:eastAsia="Arial" w:cs="Arial"/>
       <w:sz w:val="22"/>
       <w:szCs w:val="22"/>
     </w:rPr>
@@ -2258,6 +2260,7 @@
     <w:next w:val="BodyText"/>
     <w:qFormat/>
     <w:rPr>
+      <w:rFonts w:ascii="Arial" w:hAnsi="Arial" w:eastAsia="Arial" w:cs="Arial"/>
       <w:sz w:val="22"/>
       <w:szCs w:val="22"/>
     </w:rPr>
@@ -2272,6 +2275,9 @@
     <w:pPr>
       <w:spacing w:after="36" w:before="36"/>
     </w:pPr>
+    <w:rPr>
+      <w:rFonts w:ascii="Arial" w:hAnsi="Arial" w:eastAsia="Arial" w:cs="Arial"/>
+    </w:rPr>
   </w:style>
   <w:style w:styleId="Title" w:type="paragraph">
     <w:name w:val="Title"/>
@@ -2438,6 +2444,7 @@
     </w:pPr>
     <w:rPr>
       <w:i/>
+      <w:rFonts w:ascii="Arial" w:hAnsi="Arial" w:eastAsia="Arial" w:cs="Arial"/>
       <w:sz w:val="22"/>
       <w:szCs w:val="22"/>
     </w:rPr>
@@ -2453,6 +2460,7 @@
     <w:name w:val="Image Caption"/>
     <w:basedOn w:val="Caption"/>
     <w:rPr>
+      <w:rFonts w:ascii="Arial" w:hAnsi="Arial" w:eastAsia="Arial" w:cs="Arial"/>
       <w:sz w:val="22"/>
       <w:szCs w:val="22"/>
     </w:rPr>

</xml_diff>